<commit_message>
Updated files, trying to push everything before moving repo localy
</commit_message>
<xml_diff>
--- a/Sim summaries.docx
+++ b/Sim summaries.docx
@@ -1,6 +1,6 @@
 
 <file path=word/document.xml><?xml version="1.0" encoding="utf-8"?>
-<w:document xmlns:wpc="http://schemas.microsoft.com/office/word/2010/wordprocessingCanvas" xmlns:cx="http://schemas.microsoft.com/office/drawing/2014/chartex" xmlns:cx1="http://schemas.microsoft.com/office/drawing/2015/9/8/chartex" xmlns:cx2="http://schemas.microsoft.com/office/drawing/2015/10/21/chartex" xmlns:cx3="http://schemas.microsoft.com/office/drawing/2016/5/9/chartex" xmlns:cx4="http://schemas.microsoft.com/office/drawing/2016/5/10/chartex" xmlns:cx5="http://schemas.microsoft.com/office/drawing/2016/5/11/chartex" xmlns:cx6="http://schemas.microsoft.com/office/drawing/2016/5/12/chartex" xmlns:cx7="http://schemas.microsoft.com/office/drawing/2016/5/13/chartex" xmlns:cx8="http://schemas.microsoft.com/office/drawing/2016/5/14/chartex" xmlns:mc="http://schemas.openxmlformats.org/markup-compatibility/2006" xmlns:aink="http://schemas.microsoft.com/office/drawing/2016/ink" xmlns:am3d="http://schemas.microsoft.com/office/drawing/2017/model3d" xmlns:o="urn:schemas-microsoft-com:office:office" xmlns:oel="http://schemas.microsoft.com/office/2019/extlst" xmlns:r="http://schemas.openxmlformats.org/officeDocument/2006/relationships" xmlns:m="http://schemas.openxmlformats.org/officeDocument/2006/math" xmlns:v="urn:schemas-microsoft-com:vml" xmlns:wp14="http://schemas.microsoft.com/office/word/2010/wordprocessingDrawing" xmlns:wp="http://schemas.openxmlformats.org/drawingml/2006/wordprocessingDrawing" xmlns:w10="urn:schemas-microsoft-com:office:word" xmlns:w="http://schemas.openxmlformats.org/wordprocessingml/2006/main" xmlns:w14="http://schemas.microsoft.com/office/word/2010/wordml" xmlns:w15="http://schemas.microsoft.com/office/word/2012/wordml" xmlns:w16cex="http://schemas.microsoft.com/office/word/2018/wordml/cex" xmlns:w16cid="http://schemas.microsoft.com/office/word/2016/wordml/cid" xmlns:w16="http://schemas.microsoft.com/office/word/2018/wordml" xmlns:w16sdtdh="http://schemas.microsoft.com/office/word/2020/wordml/sdtdatahash" xmlns:w16se="http://schemas.microsoft.com/office/word/2015/wordml/symex" xmlns:wpg="http://schemas.microsoft.com/office/word/2010/wordprocessingGroup" xmlns:wpi="http://schemas.microsoft.com/office/word/2010/wordprocessingInk" xmlns:wne="http://schemas.microsoft.com/office/word/2006/wordml" xmlns:wps="http://schemas.microsoft.com/office/word/2010/wordprocessingShape" mc:Ignorable="w14 w15 w16se w16cid w16 w16cex w16sdtdh wp14">
+<w:document xmlns:wpc="http://schemas.microsoft.com/office/word/2010/wordprocessingCanvas" xmlns:cx="http://schemas.microsoft.com/office/drawing/2014/chartex" xmlns:cx1="http://schemas.microsoft.com/office/drawing/2015/9/8/chartex" xmlns:cx2="http://schemas.microsoft.com/office/drawing/2015/10/21/chartex" xmlns:cx3="http://schemas.microsoft.com/office/drawing/2016/5/9/chartex" xmlns:cx4="http://schemas.microsoft.com/office/drawing/2016/5/10/chartex" xmlns:cx5="http://schemas.microsoft.com/office/drawing/2016/5/11/chartex" xmlns:cx6="http://schemas.microsoft.com/office/drawing/2016/5/12/chartex" xmlns:cx7="http://schemas.microsoft.com/office/drawing/2016/5/13/chartex" xmlns:cx8="http://schemas.microsoft.com/office/drawing/2016/5/14/chartex" xmlns:mc="http://schemas.openxmlformats.org/markup-compatibility/2006" xmlns:aink="http://schemas.microsoft.com/office/drawing/2016/ink" xmlns:am3d="http://schemas.microsoft.com/office/drawing/2017/model3d" xmlns:o="urn:schemas-microsoft-com:office:office" xmlns:oel="http://schemas.microsoft.com/office/2019/extlst" xmlns:r="http://schemas.openxmlformats.org/officeDocument/2006/relationships" xmlns:m="http://schemas.openxmlformats.org/officeDocument/2006/math" xmlns:v="urn:schemas-microsoft-com:vml" xmlns:wp14="http://schemas.microsoft.com/office/word/2010/wordprocessingDrawing" xmlns:wp="http://schemas.openxmlformats.org/drawingml/2006/wordprocessingDrawing" xmlns:w10="urn:schemas-microsoft-com:office:word" xmlns:w="http://schemas.openxmlformats.org/wordprocessingml/2006/main" xmlns:w14="http://schemas.microsoft.com/office/word/2010/wordml" xmlns:w15="http://schemas.microsoft.com/office/word/2012/wordml" xmlns:w16cex="http://schemas.microsoft.com/office/word/2018/wordml/cex" xmlns:w16cid="http://schemas.microsoft.com/office/word/2016/wordml/cid" xmlns:w16="http://schemas.microsoft.com/office/word/2018/wordml" xmlns:w16du="http://schemas.microsoft.com/office/word/2023/wordml/word16du" xmlns:w16sdtdh="http://schemas.microsoft.com/office/word/2020/wordml/sdtdatahash" xmlns:w16se="http://schemas.microsoft.com/office/word/2015/wordml/symex" xmlns:wpg="http://schemas.microsoft.com/office/word/2010/wordprocessingGroup" xmlns:wpi="http://schemas.microsoft.com/office/word/2010/wordprocessingInk" xmlns:wne="http://schemas.microsoft.com/office/word/2006/wordml" xmlns:wps="http://schemas.microsoft.com/office/word/2010/wordprocessingShape" mc:Ignorable="w14 w15 w16se w16cid w16 w16cex w16sdtdh w16du wp14">
   <w:body>
     <w:p>
       <w:pPr>
@@ -39,27 +39,49 @@
         <w:rPr>
           <w:lang w:val="en-US"/>
         </w:rPr>
-        <w:t>First test set uses neutral parameters (D = 8/6 ; L0 = 1.5/1.2 ; Sig = 30/40), next set uses parameters typical of leopard setup</w:t>
-      </w:r>
-    </w:p>
-    <w:p>
-      <w:pPr>
-        <w:rPr>
-          <w:lang w:val="en-US"/>
-        </w:rPr>
-      </w:pPr>
-    </w:p>
-    <w:p>
-      <w:pPr>
-        <w:rPr>
-          <w:lang w:val="en-US"/>
-        </w:rPr>
-      </w:pPr>
-      <w:r>
-        <w:rPr>
-          <w:lang w:val="en-US"/>
-        </w:rPr>
-        <w:t xml:space="preserve">GroupDesignTest: </w:t>
+        <w:t>First test set uses neutral parameters (D = 8/</w:t>
+      </w:r>
+      <w:proofErr w:type="gramStart"/>
+      <w:r>
+        <w:rPr>
+          <w:lang w:val="en-US"/>
+        </w:rPr>
+        <w:t>6 ;</w:t>
+      </w:r>
+      <w:proofErr w:type="gramEnd"/>
+      <w:r>
+        <w:rPr>
+          <w:lang w:val="en-US"/>
+        </w:rPr>
+        <w:t xml:space="preserve"> L0 = 1.5/1.2 ; Sig = 30/40), next set uses parameters typical of leopard setup</w:t>
+      </w:r>
+    </w:p>
+    <w:p>
+      <w:pPr>
+        <w:rPr>
+          <w:lang w:val="en-US"/>
+        </w:rPr>
+      </w:pPr>
+    </w:p>
+    <w:p>
+      <w:pPr>
+        <w:rPr>
+          <w:lang w:val="en-US"/>
+        </w:rPr>
+      </w:pPr>
+      <w:proofErr w:type="spellStart"/>
+      <w:r>
+        <w:rPr>
+          <w:lang w:val="en-US"/>
+        </w:rPr>
+        <w:t>GroupDesignTest</w:t>
+      </w:r>
+      <w:proofErr w:type="spellEnd"/>
+      <w:r>
+        <w:rPr>
+          <w:lang w:val="en-US"/>
+        </w:rPr>
+        <w:t xml:space="preserve">: </w:t>
       </w:r>
     </w:p>
     <w:p>
@@ -91,11 +113,19 @@
           <w:lang w:val="en-US"/>
         </w:rPr>
       </w:pPr>
-      <w:r>
-        <w:rPr>
-          <w:lang w:val="en-US"/>
-        </w:rPr>
-        <w:t>Enrm summaries:</w:t>
+      <w:proofErr w:type="spellStart"/>
+      <w:r>
+        <w:rPr>
+          <w:lang w:val="en-US"/>
+        </w:rPr>
+        <w:t>Enrm</w:t>
+      </w:r>
+      <w:proofErr w:type="spellEnd"/>
+      <w:r>
+        <w:rPr>
+          <w:lang w:val="en-US"/>
+        </w:rPr>
+        <w:t xml:space="preserve"> summaries:</w:t>
       </w:r>
     </w:p>
     <w:p>
@@ -131,7 +161,21 @@
         <w:rPr>
           <w:lang w:val="en-US"/>
         </w:rPr>
-        <w:t>Spacing 30: En = 113.9 ; Er = 564.7 ; Em = 502.7</w:t>
+        <w:t xml:space="preserve">Spacing 30: En = </w:t>
+      </w:r>
+      <w:proofErr w:type="gramStart"/>
+      <w:r>
+        <w:rPr>
+          <w:lang w:val="en-US"/>
+        </w:rPr>
+        <w:t>113.9 ;</w:t>
+      </w:r>
+      <w:proofErr w:type="gramEnd"/>
+      <w:r>
+        <w:rPr>
+          <w:lang w:val="en-US"/>
+        </w:rPr>
+        <w:t xml:space="preserve"> Er = 564.7 ; Em = 502.7</w:t>
       </w:r>
     </w:p>
     <w:p>
@@ -149,7 +193,21 @@
         <w:rPr>
           <w:lang w:val="en-US"/>
         </w:rPr>
-        <w:t xml:space="preserve">Spacing 40: En =  167 ; Er = 511.5 ; Em = 421.9 </w:t>
+        <w:t xml:space="preserve">Spacing 40: En </w:t>
+      </w:r>
+      <w:proofErr w:type="gramStart"/>
+      <w:r>
+        <w:rPr>
+          <w:lang w:val="en-US"/>
+        </w:rPr>
+        <w:t>=  167</w:t>
+      </w:r>
+      <w:proofErr w:type="gramEnd"/>
+      <w:r>
+        <w:rPr>
+          <w:lang w:val="en-US"/>
+        </w:rPr>
+        <w:t xml:space="preserve"> ; Er = 511.5 ; Em = 421.9 </w:t>
       </w:r>
     </w:p>
     <w:p>
@@ -185,7 +243,21 @@
         <w:rPr>
           <w:lang w:val="en-US"/>
         </w:rPr>
-        <w:t>Spacing 30: En = 103.8 ; Er = 620 ; Em = 576.5</w:t>
+        <w:t xml:space="preserve">Spacing 30: En = </w:t>
+      </w:r>
+      <w:proofErr w:type="gramStart"/>
+      <w:r>
+        <w:rPr>
+          <w:lang w:val="en-US"/>
+        </w:rPr>
+        <w:t>103.8 ;</w:t>
+      </w:r>
+      <w:proofErr w:type="gramEnd"/>
+      <w:r>
+        <w:rPr>
+          <w:lang w:val="en-US"/>
+        </w:rPr>
+        <w:t xml:space="preserve"> Er = 620 ; Em = 576.5</w:t>
       </w:r>
     </w:p>
     <w:p>
@@ -203,7 +275,21 @@
         <w:rPr>
           <w:lang w:val="en-US"/>
         </w:rPr>
-        <w:t>Spacing 40: En =  146.4 ; Er = 577.4 ; Em = 514.6</w:t>
+        <w:t xml:space="preserve">Spacing 40: En </w:t>
+      </w:r>
+      <w:proofErr w:type="gramStart"/>
+      <w:r>
+        <w:rPr>
+          <w:lang w:val="en-US"/>
+        </w:rPr>
+        <w:t>=  146.4</w:t>
+      </w:r>
+      <w:proofErr w:type="gramEnd"/>
+      <w:r>
+        <w:rPr>
+          <w:lang w:val="en-US"/>
+        </w:rPr>
+        <w:t xml:space="preserve"> ; Er = 577.4 ; Em = 514.6</w:t>
       </w:r>
     </w:p>
     <w:p>
@@ -267,11 +353,19 @@
           <w:lang w:val="en-US"/>
         </w:rPr>
       </w:pPr>
-      <w:r>
-        <w:rPr>
-          <w:lang w:val="en-US"/>
-        </w:rPr>
-        <w:t>Enrm summaries:</w:t>
+      <w:proofErr w:type="spellStart"/>
+      <w:r>
+        <w:rPr>
+          <w:lang w:val="en-US"/>
+        </w:rPr>
+        <w:t>Enrm</w:t>
+      </w:r>
+      <w:proofErr w:type="spellEnd"/>
+      <w:r>
+        <w:rPr>
+          <w:lang w:val="en-US"/>
+        </w:rPr>
+        <w:t xml:space="preserve"> summaries:</w:t>
       </w:r>
     </w:p>
     <w:p>
@@ -319,7 +413,21 @@
         <w:rPr>
           <w:lang w:val="en-US"/>
         </w:rPr>
-        <w:t>Spacing 30: En = 79.9 ; Er = 354.4 ; Em = 312.5</w:t>
+        <w:t xml:space="preserve">Spacing 30: En = </w:t>
+      </w:r>
+      <w:proofErr w:type="gramStart"/>
+      <w:r>
+        <w:rPr>
+          <w:lang w:val="en-US"/>
+        </w:rPr>
+        <w:t>79.9 ;</w:t>
+      </w:r>
+      <w:proofErr w:type="gramEnd"/>
+      <w:r>
+        <w:rPr>
+          <w:lang w:val="en-US"/>
+        </w:rPr>
+        <w:t xml:space="preserve"> Er = 354.4 ; Em = 312.5</w:t>
       </w:r>
     </w:p>
     <w:p>
@@ -337,7 +445,21 @@
         <w:rPr>
           <w:lang w:val="en-US"/>
         </w:rPr>
-        <w:t xml:space="preserve">Spacing 40: En =  113.3 ; Er = 321 ; Em = 261.7 </w:t>
+        <w:t xml:space="preserve">Spacing 40: En </w:t>
+      </w:r>
+      <w:proofErr w:type="gramStart"/>
+      <w:r>
+        <w:rPr>
+          <w:lang w:val="en-US"/>
+        </w:rPr>
+        <w:t>=  113.3</w:t>
+      </w:r>
+      <w:proofErr w:type="gramEnd"/>
+      <w:r>
+        <w:rPr>
+          <w:lang w:val="en-US"/>
+        </w:rPr>
+        <w:t xml:space="preserve"> ; Er = 321 ; Em = 261.7 </w:t>
       </w:r>
     </w:p>
     <w:p>
@@ -373,7 +495,21 @@
         <w:rPr>
           <w:lang w:val="en-US"/>
         </w:rPr>
-        <w:t xml:space="preserve">Spacing 30: En =  75 ; Er = 388.2  ; Em = 358.1 </w:t>
+        <w:t xml:space="preserve">Spacing 30: En </w:t>
+      </w:r>
+      <w:proofErr w:type="gramStart"/>
+      <w:r>
+        <w:rPr>
+          <w:lang w:val="en-US"/>
+        </w:rPr>
+        <w:t>=  75</w:t>
+      </w:r>
+      <w:proofErr w:type="gramEnd"/>
+      <w:r>
+        <w:rPr>
+          <w:lang w:val="en-US"/>
+        </w:rPr>
+        <w:t xml:space="preserve"> ; Er = 388.2  ; Em = 358.1 </w:t>
       </w:r>
     </w:p>
     <w:p>
@@ -391,7 +527,21 @@
         <w:rPr>
           <w:lang w:val="en-US"/>
         </w:rPr>
-        <w:t>Spacing 40: En =  102 ; Er = 361.3 ; Em = 319</w:t>
+        <w:t xml:space="preserve">Spacing 40: En </w:t>
+      </w:r>
+      <w:proofErr w:type="gramStart"/>
+      <w:r>
+        <w:rPr>
+          <w:lang w:val="en-US"/>
+        </w:rPr>
+        <w:t>=  102</w:t>
+      </w:r>
+      <w:proofErr w:type="gramEnd"/>
+      <w:r>
+        <w:rPr>
+          <w:lang w:val="en-US"/>
+        </w:rPr>
+        <w:t xml:space="preserve"> ; Er = 361.3 ; Em = 319</w:t>
       </w:r>
     </w:p>
     <w:p>
@@ -455,11 +605,19 @@
           <w:lang w:val="en-US"/>
         </w:rPr>
       </w:pPr>
-      <w:r>
-        <w:rPr>
-          <w:lang w:val="en-US"/>
-        </w:rPr>
-        <w:t>Enrm summaries:</w:t>
+      <w:proofErr w:type="spellStart"/>
+      <w:r>
+        <w:rPr>
+          <w:lang w:val="en-US"/>
+        </w:rPr>
+        <w:t>Enrm</w:t>
+      </w:r>
+      <w:proofErr w:type="spellEnd"/>
+      <w:r>
+        <w:rPr>
+          <w:lang w:val="en-US"/>
+        </w:rPr>
+        <w:t xml:space="preserve"> summaries:</w:t>
       </w:r>
     </w:p>
     <w:p>
@@ -507,7 +665,21 @@
         <w:rPr>
           <w:lang w:val="en-US"/>
         </w:rPr>
-        <w:t>Spacing 30: En = 113.9 ; Er = 564.7 ; Em = 502.7</w:t>
+        <w:t xml:space="preserve">Spacing 30: En = </w:t>
+      </w:r>
+      <w:proofErr w:type="gramStart"/>
+      <w:r>
+        <w:rPr>
+          <w:lang w:val="en-US"/>
+        </w:rPr>
+        <w:t>113.9 ;</w:t>
+      </w:r>
+      <w:proofErr w:type="gramEnd"/>
+      <w:r>
+        <w:rPr>
+          <w:lang w:val="en-US"/>
+        </w:rPr>
+        <w:t xml:space="preserve"> Er = 564.7 ; Em = 502.7</w:t>
       </w:r>
     </w:p>
     <w:p>
@@ -525,7 +697,21 @@
         <w:rPr>
           <w:lang w:val="en-US"/>
         </w:rPr>
-        <w:t xml:space="preserve">Spacing 40: En =  167 ; Er = 511.5 ; Em = 421.9 </w:t>
+        <w:t xml:space="preserve">Spacing 40: En </w:t>
+      </w:r>
+      <w:proofErr w:type="gramStart"/>
+      <w:r>
+        <w:rPr>
+          <w:lang w:val="en-US"/>
+        </w:rPr>
+        <w:t>=  167</w:t>
+      </w:r>
+      <w:proofErr w:type="gramEnd"/>
+      <w:r>
+        <w:rPr>
+          <w:lang w:val="en-US"/>
+        </w:rPr>
+        <w:t xml:space="preserve"> ; Er = 511.5 ; Em = 421.9 </w:t>
       </w:r>
     </w:p>
     <w:p>
@@ -561,7 +747,21 @@
         <w:rPr>
           <w:lang w:val="en-US"/>
         </w:rPr>
-        <w:t xml:space="preserve">Spacing 30: En =  103.8 ; Er = 620  ; Em = 576.5 </w:t>
+        <w:t xml:space="preserve">Spacing 30: En </w:t>
+      </w:r>
+      <w:proofErr w:type="gramStart"/>
+      <w:r>
+        <w:rPr>
+          <w:lang w:val="en-US"/>
+        </w:rPr>
+        <w:t>=  103.8</w:t>
+      </w:r>
+      <w:proofErr w:type="gramEnd"/>
+      <w:r>
+        <w:rPr>
+          <w:lang w:val="en-US"/>
+        </w:rPr>
+        <w:t xml:space="preserve"> ; Er = 620  ; Em = 576.5 </w:t>
       </w:r>
     </w:p>
     <w:p>
@@ -579,7 +779,21 @@
         <w:rPr>
           <w:lang w:val="en-US"/>
         </w:rPr>
-        <w:t xml:space="preserve">Spacing 40: En =  146.4 ; Er = 577.4 ; Em = 116.5 </w:t>
+        <w:t xml:space="preserve">Spacing 40: En </w:t>
+      </w:r>
+      <w:proofErr w:type="gramStart"/>
+      <w:r>
+        <w:rPr>
+          <w:lang w:val="en-US"/>
+        </w:rPr>
+        <w:t>=  146.4</w:t>
+      </w:r>
+      <w:proofErr w:type="gramEnd"/>
+      <w:r>
+        <w:rPr>
+          <w:lang w:val="en-US"/>
+        </w:rPr>
+        <w:t xml:space="preserve"> ; Er = 577.4 ; Em = 116.5 </w:t>
       </w:r>
     </w:p>
     <w:p>
@@ -636,11 +850,19 @@
           <w:lang w:val="en-US"/>
         </w:rPr>
       </w:pPr>
-      <w:r>
-        <w:rPr>
-          <w:lang w:val="en-US"/>
-        </w:rPr>
-        <w:t>Enrm summaries:</w:t>
+      <w:proofErr w:type="spellStart"/>
+      <w:r>
+        <w:rPr>
+          <w:lang w:val="en-US"/>
+        </w:rPr>
+        <w:t>Enrm</w:t>
+      </w:r>
+      <w:proofErr w:type="spellEnd"/>
+      <w:r>
+        <w:rPr>
+          <w:lang w:val="en-US"/>
+        </w:rPr>
+        <w:t xml:space="preserve"> summaries:</w:t>
       </w:r>
     </w:p>
     <w:p>
@@ -700,7 +922,21 @@
         <w:rPr>
           <w:lang w:val="en-US"/>
         </w:rPr>
-        <w:t>: En = 113.9 ; Er = 564.7 ; Em = 502.7</w:t>
+        <w:t xml:space="preserve">: En = </w:t>
+      </w:r>
+      <w:proofErr w:type="gramStart"/>
+      <w:r>
+        <w:rPr>
+          <w:lang w:val="en-US"/>
+        </w:rPr>
+        <w:t>113.9 ;</w:t>
+      </w:r>
+      <w:proofErr w:type="gramEnd"/>
+      <w:r>
+        <w:rPr>
+          <w:lang w:val="en-US"/>
+        </w:rPr>
+        <w:t xml:space="preserve"> Er = 564.7 ; Em = 502.7</w:t>
       </w:r>
     </w:p>
     <w:p>
@@ -730,7 +966,21 @@
         <w:rPr>
           <w:lang w:val="en-US"/>
         </w:rPr>
-        <w:t xml:space="preserve">: En =  167 ; Er = 511.5 ; Em = 421.9 </w:t>
+        <w:t xml:space="preserve">: En </w:t>
+      </w:r>
+      <w:proofErr w:type="gramStart"/>
+      <w:r>
+        <w:rPr>
+          <w:lang w:val="en-US"/>
+        </w:rPr>
+        <w:t>=  167</w:t>
+      </w:r>
+      <w:proofErr w:type="gramEnd"/>
+      <w:r>
+        <w:rPr>
+          <w:lang w:val="en-US"/>
+        </w:rPr>
+        <w:t xml:space="preserve"> ; Er = 511.5 ; Em = 421.9 </w:t>
       </w:r>
     </w:p>
     <w:p>
@@ -778,7 +1028,21 @@
         <w:rPr>
           <w:lang w:val="en-US"/>
         </w:rPr>
-        <w:t xml:space="preserve">: En =  103.8 ; Er = 620  ; Em = 576.5 </w:t>
+        <w:t xml:space="preserve">: En </w:t>
+      </w:r>
+      <w:proofErr w:type="gramStart"/>
+      <w:r>
+        <w:rPr>
+          <w:lang w:val="en-US"/>
+        </w:rPr>
+        <w:t>=  103.8</w:t>
+      </w:r>
+      <w:proofErr w:type="gramEnd"/>
+      <w:r>
+        <w:rPr>
+          <w:lang w:val="en-US"/>
+        </w:rPr>
+        <w:t xml:space="preserve"> ; Er = 620  ; Em = 576.5 </w:t>
       </w:r>
     </w:p>
     <w:p>
@@ -808,7 +1072,21 @@
         <w:rPr>
           <w:lang w:val="en-US"/>
         </w:rPr>
-        <w:t xml:space="preserve">: En =  146.4 ; Er = 577.4 ; Em = 116.5 </w:t>
+        <w:t xml:space="preserve">: En </w:t>
+      </w:r>
+      <w:proofErr w:type="gramStart"/>
+      <w:r>
+        <w:rPr>
+          <w:lang w:val="en-US"/>
+        </w:rPr>
+        <w:t>=  146.4</w:t>
+      </w:r>
+      <w:proofErr w:type="gramEnd"/>
+      <w:r>
+        <w:rPr>
+          <w:lang w:val="en-US"/>
+        </w:rPr>
+        <w:t xml:space="preserve"> ; Er = 577.4 ; Em = 116.5 </w:t>
       </w:r>
     </w:p>
     <w:p>
@@ -827,12 +1105,20 @@
           <w:lang w:val="en-US"/>
         </w:rPr>
       </w:pPr>
+      <w:proofErr w:type="spellStart"/>
       <w:r>
         <w:rPr>
           <w:lang w:val="en-US"/>
         </w:rPr>
         <w:lastRenderedPageBreak/>
-        <w:t xml:space="preserve">GroupDesign: </w:t>
+        <w:t>GroupDesign</w:t>
+      </w:r>
+      <w:proofErr w:type="spellEnd"/>
+      <w:r>
+        <w:rPr>
+          <w:lang w:val="en-US"/>
+        </w:rPr>
+        <w:t xml:space="preserve">: </w:t>
       </w:r>
     </w:p>
     <w:p>
@@ -868,7 +1154,21 @@
         <w:rPr>
           <w:lang w:val="en-US"/>
         </w:rPr>
-        <w:t>Note that GDb does the same but in one go</w:t>
+        <w:t xml:space="preserve">Note that </w:t>
+      </w:r>
+      <w:proofErr w:type="spellStart"/>
+      <w:r>
+        <w:rPr>
+          <w:lang w:val="en-US"/>
+        </w:rPr>
+        <w:t>GDb</w:t>
+      </w:r>
+      <w:proofErr w:type="spellEnd"/>
+      <w:r>
+        <w:rPr>
+          <w:lang w:val="en-US"/>
+        </w:rPr>
+        <w:t xml:space="preserve"> does the same but in one go</w:t>
       </w:r>
     </w:p>
     <w:p>
@@ -882,11 +1182,19 @@
           <w:lang w:val="en-US"/>
         </w:rPr>
       </w:pPr>
-      <w:r>
-        <w:rPr>
-          <w:lang w:val="en-US"/>
-        </w:rPr>
-        <w:t>Enrm summaries:</w:t>
+      <w:proofErr w:type="spellStart"/>
+      <w:r>
+        <w:rPr>
+          <w:lang w:val="en-US"/>
+        </w:rPr>
+        <w:t>Enrm</w:t>
+      </w:r>
+      <w:proofErr w:type="spellEnd"/>
+      <w:r>
+        <w:rPr>
+          <w:lang w:val="en-US"/>
+        </w:rPr>
+        <w:t xml:space="preserve"> summaries:</w:t>
       </w:r>
     </w:p>
     <w:p>
@@ -922,7 +1230,21 @@
         <w:rPr>
           <w:lang w:val="en-US"/>
         </w:rPr>
-        <w:t>Spacing 4000: En = 100.9 ; Er = 252 ; Em = 208.5</w:t>
+        <w:t xml:space="preserve">Spacing 4000: En = </w:t>
+      </w:r>
+      <w:proofErr w:type="gramStart"/>
+      <w:r>
+        <w:rPr>
+          <w:lang w:val="en-US"/>
+        </w:rPr>
+        <w:t>100.9 ;</w:t>
+      </w:r>
+      <w:proofErr w:type="gramEnd"/>
+      <w:r>
+        <w:rPr>
+          <w:lang w:val="en-US"/>
+        </w:rPr>
+        <w:t xml:space="preserve"> Er = 252 ; Em = 208.5</w:t>
       </w:r>
     </w:p>
     <w:p>
@@ -940,7 +1262,21 @@
         <w:rPr>
           <w:lang w:val="en-US"/>
         </w:rPr>
-        <w:t>Spacing 6000: En = 167.8 ; Er = 185.7 ; Em = 120</w:t>
+        <w:t xml:space="preserve">Spacing 6000: En = </w:t>
+      </w:r>
+      <w:proofErr w:type="gramStart"/>
+      <w:r>
+        <w:rPr>
+          <w:lang w:val="en-US"/>
+        </w:rPr>
+        <w:t>167.8 ;</w:t>
+      </w:r>
+      <w:proofErr w:type="gramEnd"/>
+      <w:r>
+        <w:rPr>
+          <w:lang w:val="en-US"/>
+        </w:rPr>
+        <w:t xml:space="preserve"> Er = 185.7 ; Em = 120</w:t>
       </w:r>
     </w:p>
     <w:p>
@@ -976,7 +1312,21 @@
         <w:rPr>
           <w:lang w:val="en-US"/>
         </w:rPr>
-        <w:t>Spacing 4000: En = 33.1 ; Er = 193 ; Em = 181.7</w:t>
+        <w:t xml:space="preserve">Spacing 4000: En = </w:t>
+      </w:r>
+      <w:proofErr w:type="gramStart"/>
+      <w:r>
+        <w:rPr>
+          <w:lang w:val="en-US"/>
+        </w:rPr>
+        <w:t>33.1 ;</w:t>
+      </w:r>
+      <w:proofErr w:type="gramEnd"/>
+      <w:r>
+        <w:rPr>
+          <w:lang w:val="en-US"/>
+        </w:rPr>
+        <w:t xml:space="preserve"> Er = 193 ; Em = 181.7</w:t>
       </w:r>
     </w:p>
     <w:p>
@@ -994,7 +1344,21 @@
         <w:rPr>
           <w:lang w:val="en-US"/>
         </w:rPr>
-        <w:t>Spacing 6000: En = 53.1 ; Er = 173.1 ; Em = 154.4</w:t>
+        <w:t xml:space="preserve">Spacing 6000: En = </w:t>
+      </w:r>
+      <w:proofErr w:type="gramStart"/>
+      <w:r>
+        <w:rPr>
+          <w:lang w:val="en-US"/>
+        </w:rPr>
+        <w:t>53.1 ;</w:t>
+      </w:r>
+      <w:proofErr w:type="gramEnd"/>
+      <w:r>
+        <w:rPr>
+          <w:lang w:val="en-US"/>
+        </w:rPr>
+        <w:t xml:space="preserve"> Er = 173.1 ; Em = 154.4</w:t>
       </w:r>
     </w:p>
     <w:p>
@@ -1012,7 +1376,35 @@
         <w:rPr>
           <w:lang w:val="en-US"/>
         </w:rPr>
-        <w:t>Note that GroupDesignb does the same thing but in one go using trapindex argument</w:t>
+        <w:t xml:space="preserve">Note that </w:t>
+      </w:r>
+      <w:proofErr w:type="spellStart"/>
+      <w:r>
+        <w:rPr>
+          <w:lang w:val="en-US"/>
+        </w:rPr>
+        <w:t>GroupDesignb</w:t>
+      </w:r>
+      <w:proofErr w:type="spellEnd"/>
+      <w:r>
+        <w:rPr>
+          <w:lang w:val="en-US"/>
+        </w:rPr>
+        <w:t xml:space="preserve"> does the same thing but in one go using </w:t>
+      </w:r>
+      <w:proofErr w:type="spellStart"/>
+      <w:r>
+        <w:rPr>
+          <w:lang w:val="en-US"/>
+        </w:rPr>
+        <w:t>trapindex</w:t>
+      </w:r>
+      <w:proofErr w:type="spellEnd"/>
+      <w:r>
+        <w:rPr>
+          <w:lang w:val="en-US"/>
+        </w:rPr>
+        <w:t xml:space="preserve"> argument</w:t>
       </w:r>
     </w:p>
     <w:p>
@@ -1058,11 +1450,19 @@
           <w:lang w:val="en-US"/>
         </w:rPr>
       </w:pPr>
-      <w:r>
-        <w:rPr>
-          <w:lang w:val="en-US"/>
-        </w:rPr>
-        <w:t>Enrm summaries:</w:t>
+      <w:proofErr w:type="spellStart"/>
+      <w:r>
+        <w:rPr>
+          <w:lang w:val="en-US"/>
+        </w:rPr>
+        <w:t>Enrm</w:t>
+      </w:r>
+      <w:proofErr w:type="spellEnd"/>
+      <w:r>
+        <w:rPr>
+          <w:lang w:val="en-US"/>
+        </w:rPr>
+        <w:t xml:space="preserve"> summaries:</w:t>
       </w:r>
     </w:p>
     <w:p>
@@ -1098,7 +1498,21 @@
         <w:rPr>
           <w:lang w:val="en-US"/>
         </w:rPr>
-        <w:t>Spacing 4000: En = 100.1 ; Er = 41.3 ; Em = 34.3</w:t>
+        <w:t xml:space="preserve">Spacing 4000: En = </w:t>
+      </w:r>
+      <w:proofErr w:type="gramStart"/>
+      <w:r>
+        <w:rPr>
+          <w:lang w:val="en-US"/>
+        </w:rPr>
+        <w:t>100.1 ;</w:t>
+      </w:r>
+      <w:proofErr w:type="gramEnd"/>
+      <w:r>
+        <w:rPr>
+          <w:lang w:val="en-US"/>
+        </w:rPr>
+        <w:t xml:space="preserve"> Er = 41.3 ; Em = 34.3</w:t>
       </w:r>
     </w:p>
     <w:p>
@@ -1116,7 +1530,21 @@
         <w:rPr>
           <w:lang w:val="en-US"/>
         </w:rPr>
-        <w:t>Spacing 6000: En = 119.0 ; Er = 22.4 ; Em = 14.6</w:t>
+        <w:t xml:space="preserve">Spacing 6000: En = </w:t>
+      </w:r>
+      <w:proofErr w:type="gramStart"/>
+      <w:r>
+        <w:rPr>
+          <w:lang w:val="en-US"/>
+        </w:rPr>
+        <w:t>119.0 ;</w:t>
+      </w:r>
+      <w:proofErr w:type="gramEnd"/>
+      <w:r>
+        <w:rPr>
+          <w:lang w:val="en-US"/>
+        </w:rPr>
+        <w:t xml:space="preserve"> Er = 22.4 ; Em = 14.6</w:t>
       </w:r>
     </w:p>
     <w:p>
@@ -1152,7 +1580,21 @@
         <w:rPr>
           <w:lang w:val="en-US"/>
         </w:rPr>
-        <w:t>Spacing 4000: En = 64.5 ; Er = 36.0 ; Em = 32.3</w:t>
+        <w:t xml:space="preserve">Spacing 4000: En = </w:t>
+      </w:r>
+      <w:proofErr w:type="gramStart"/>
+      <w:r>
+        <w:rPr>
+          <w:lang w:val="en-US"/>
+        </w:rPr>
+        <w:t>64.5 ;</w:t>
+      </w:r>
+      <w:proofErr w:type="gramEnd"/>
+      <w:r>
+        <w:rPr>
+          <w:lang w:val="en-US"/>
+        </w:rPr>
+        <w:t xml:space="preserve"> Er = 36.0 ; Em = 32.3</w:t>
       </w:r>
     </w:p>
     <w:p>
@@ -1170,7 +1612,21 @@
         <w:rPr>
           <w:lang w:val="en-US"/>
         </w:rPr>
-        <w:t>Spacing 6000: En = 79.8 ; Er = 20.7 ; Em = 16.4</w:t>
+        <w:t xml:space="preserve">Spacing 6000: En = </w:t>
+      </w:r>
+      <w:proofErr w:type="gramStart"/>
+      <w:r>
+        <w:rPr>
+          <w:lang w:val="en-US"/>
+        </w:rPr>
+        <w:t>79.8 ;</w:t>
+      </w:r>
+      <w:proofErr w:type="gramEnd"/>
+      <w:r>
+        <w:rPr>
+          <w:lang w:val="en-US"/>
+        </w:rPr>
+        <w:t xml:space="preserve"> Er = 20.7 ; Em = 16.4</w:t>
       </w:r>
     </w:p>
     <w:p>
@@ -1228,11 +1684,19 @@
           <w:lang w:val="en-US"/>
         </w:rPr>
       </w:pPr>
-      <w:r>
-        <w:rPr>
-          <w:lang w:val="en-US"/>
-        </w:rPr>
-        <w:t>Enrm summaries:</w:t>
+      <w:proofErr w:type="spellStart"/>
+      <w:r>
+        <w:rPr>
+          <w:lang w:val="en-US"/>
+        </w:rPr>
+        <w:t>Enrm</w:t>
+      </w:r>
+      <w:proofErr w:type="spellEnd"/>
+      <w:r>
+        <w:rPr>
+          <w:lang w:val="en-US"/>
+        </w:rPr>
+        <w:t xml:space="preserve"> summaries:</w:t>
       </w:r>
     </w:p>
     <w:p>
@@ -1268,7 +1732,21 @@
         <w:rPr>
           <w:lang w:val="en-US"/>
         </w:rPr>
-        <w:t>Spacing 6000: En =84.9 ; Er = 88.3 ; Em = 55.6</w:t>
+        <w:t>Spacing 6000: En =84.</w:t>
+      </w:r>
+      <w:proofErr w:type="gramStart"/>
+      <w:r>
+        <w:rPr>
+          <w:lang w:val="en-US"/>
+        </w:rPr>
+        <w:t>9 ;</w:t>
+      </w:r>
+      <w:proofErr w:type="gramEnd"/>
+      <w:r>
+        <w:rPr>
+          <w:lang w:val="en-US"/>
+        </w:rPr>
+        <w:t xml:space="preserve"> Er = 88.3 ; Em = 55.6</w:t>
       </w:r>
     </w:p>
     <w:p>
@@ -1286,7 +1764,21 @@
         <w:rPr>
           <w:lang w:val="en-US"/>
         </w:rPr>
-        <w:t>Spacing 12000: En = 128.4 ; Er = 44.8 ; Em = 3.0</w:t>
+        <w:t xml:space="preserve">Spacing 12000: En = </w:t>
+      </w:r>
+      <w:proofErr w:type="gramStart"/>
+      <w:r>
+        <w:rPr>
+          <w:lang w:val="en-US"/>
+        </w:rPr>
+        <w:t>128.4 ;</w:t>
+      </w:r>
+      <w:proofErr w:type="gramEnd"/>
+      <w:r>
+        <w:rPr>
+          <w:lang w:val="en-US"/>
+        </w:rPr>
+        <w:t xml:space="preserve"> Er = 44.8 ; Em = 3.0</w:t>
       </w:r>
     </w:p>
     <w:p>
@@ -1322,7 +1814,21 @@
         <w:rPr>
           <w:lang w:val="en-US"/>
         </w:rPr>
-        <w:t>Spacing 6000: En = 29.7 ; Er = 81.1 ; Em = 71.2</w:t>
+        <w:t xml:space="preserve">Spacing 6000: En = </w:t>
+      </w:r>
+      <w:proofErr w:type="gramStart"/>
+      <w:r>
+        <w:rPr>
+          <w:lang w:val="en-US"/>
+        </w:rPr>
+        <w:t>29.7 ;</w:t>
+      </w:r>
+      <w:proofErr w:type="gramEnd"/>
+      <w:r>
+        <w:rPr>
+          <w:lang w:val="en-US"/>
+        </w:rPr>
+        <w:t xml:space="preserve"> Er = 81.1 ; Em = 71.2</w:t>
       </w:r>
     </w:p>
     <w:p>
@@ -1340,7 +1846,21 @@
         <w:rPr>
           <w:lang w:val="en-US"/>
         </w:rPr>
-        <w:t>Spacing 12000: En = 61.3 ; Er = 49.5 ; Em = 31.2</w:t>
+        <w:t xml:space="preserve">Spacing 12000: En = </w:t>
+      </w:r>
+      <w:proofErr w:type="gramStart"/>
+      <w:r>
+        <w:rPr>
+          <w:lang w:val="en-US"/>
+        </w:rPr>
+        <w:t>61.3 ;</w:t>
+      </w:r>
+      <w:proofErr w:type="gramEnd"/>
+      <w:r>
+        <w:rPr>
+          <w:lang w:val="en-US"/>
+        </w:rPr>
+        <w:t xml:space="preserve"> Er = 49.5 ; Em = 31.2</w:t>
       </w:r>
     </w:p>
     <w:p>
@@ -1385,11 +1905,19 @@
           <w:lang w:val="en-US"/>
         </w:rPr>
       </w:pPr>
-      <w:r>
-        <w:rPr>
-          <w:lang w:val="en-US"/>
-        </w:rPr>
-        <w:t>Enrm summaries:</w:t>
+      <w:proofErr w:type="spellStart"/>
+      <w:r>
+        <w:rPr>
+          <w:lang w:val="en-US"/>
+        </w:rPr>
+        <w:t>Enrm</w:t>
+      </w:r>
+      <w:proofErr w:type="spellEnd"/>
+      <w:r>
+        <w:rPr>
+          <w:lang w:val="en-US"/>
+        </w:rPr>
+        <w:t xml:space="preserve"> summaries:</w:t>
       </w:r>
     </w:p>
     <w:p>
@@ -1425,7 +1953,21 @@
         <w:rPr>
           <w:lang w:val="en-US"/>
         </w:rPr>
-        <w:t>Spacing 4000: En = 23.9 ; Er = 86.9 ; Em = 70.1</w:t>
+        <w:t xml:space="preserve">Spacing 4000: En = </w:t>
+      </w:r>
+      <w:proofErr w:type="gramStart"/>
+      <w:r>
+        <w:rPr>
+          <w:lang w:val="en-US"/>
+        </w:rPr>
+        <w:t>23.9 ;</w:t>
+      </w:r>
+      <w:proofErr w:type="gramEnd"/>
+      <w:r>
+        <w:rPr>
+          <w:lang w:val="en-US"/>
+        </w:rPr>
+        <w:t xml:space="preserve"> Er = 86.9 ; Em = 70.1</w:t>
       </w:r>
     </w:p>
     <w:p>
@@ -1443,7 +1985,21 @@
         <w:rPr>
           <w:lang w:val="en-US"/>
         </w:rPr>
-        <w:t>Spacing 6000: En = 39.8 ; Er = 71.0 ; Em = 44.5</w:t>
+        <w:t xml:space="preserve">Spacing 6000: En = </w:t>
+      </w:r>
+      <w:proofErr w:type="gramStart"/>
+      <w:r>
+        <w:rPr>
+          <w:lang w:val="en-US"/>
+        </w:rPr>
+        <w:t>39.8 ;</w:t>
+      </w:r>
+      <w:proofErr w:type="gramEnd"/>
+      <w:r>
+        <w:rPr>
+          <w:lang w:val="en-US"/>
+        </w:rPr>
+        <w:t xml:space="preserve"> Er = 71.0 ; Em = 44.5</w:t>
       </w:r>
     </w:p>
     <w:p>
@@ -1479,7 +2035,21 @@
         <w:rPr>
           <w:lang w:val="en-US"/>
         </w:rPr>
-        <w:t>Spacing 4000: En = 22.8 ; Er = 171.2 ; Em = 158.6</w:t>
+        <w:t xml:space="preserve">Spacing 4000: En = </w:t>
+      </w:r>
+      <w:proofErr w:type="gramStart"/>
+      <w:r>
+        <w:rPr>
+          <w:lang w:val="en-US"/>
+        </w:rPr>
+        <w:t>22.8 ;</w:t>
+      </w:r>
+      <w:proofErr w:type="gramEnd"/>
+      <w:r>
+        <w:rPr>
+          <w:lang w:val="en-US"/>
+        </w:rPr>
+        <w:t xml:space="preserve"> Er = 171.2 ; Em = 158.6</w:t>
       </w:r>
     </w:p>
     <w:p>
@@ -1497,7 +2067,21 @@
         <w:rPr>
           <w:lang w:val="en-US"/>
         </w:rPr>
-        <w:t>Spacing 6000: En = 33.5 ; Er = 160.4 ; Em = 140.3</w:t>
+        <w:t xml:space="preserve">Spacing 6000: En = </w:t>
+      </w:r>
+      <w:proofErr w:type="gramStart"/>
+      <w:r>
+        <w:rPr>
+          <w:lang w:val="en-US"/>
+        </w:rPr>
+        <w:t>33.5 ;</w:t>
+      </w:r>
+      <w:proofErr w:type="gramEnd"/>
+      <w:r>
+        <w:rPr>
+          <w:lang w:val="en-US"/>
+        </w:rPr>
+        <w:t xml:space="preserve"> Er = 160.4 ; Em = 140.3</w:t>
       </w:r>
     </w:p>
     <w:p>
@@ -1554,11 +2138,19 @@
           <w:lang w:val="en-US"/>
         </w:rPr>
       </w:pPr>
-      <w:r>
-        <w:rPr>
-          <w:lang w:val="en-US"/>
-        </w:rPr>
-        <w:t>Enrm summaries:</w:t>
+      <w:proofErr w:type="spellStart"/>
+      <w:r>
+        <w:rPr>
+          <w:lang w:val="en-US"/>
+        </w:rPr>
+        <w:t>Enrm</w:t>
+      </w:r>
+      <w:proofErr w:type="spellEnd"/>
+      <w:r>
+        <w:rPr>
+          <w:lang w:val="en-US"/>
+        </w:rPr>
+        <w:t xml:space="preserve"> summaries:</w:t>
       </w:r>
     </w:p>
     <w:p>
@@ -1594,7 +2186,21 @@
         <w:rPr>
           <w:lang w:val="en-US"/>
         </w:rPr>
-        <w:t xml:space="preserve">Spacing 4500: En = 27.7; Er = 83.2 ; Em = 63.8 </w:t>
+        <w:t xml:space="preserve">Spacing 4500: En = 27.7; Er = </w:t>
+      </w:r>
+      <w:proofErr w:type="gramStart"/>
+      <w:r>
+        <w:rPr>
+          <w:lang w:val="en-US"/>
+        </w:rPr>
+        <w:t>83.2 ;</w:t>
+      </w:r>
+      <w:proofErr w:type="gramEnd"/>
+      <w:r>
+        <w:rPr>
+          <w:lang w:val="en-US"/>
+        </w:rPr>
+        <w:t xml:space="preserve"> Em = 63.8 </w:t>
       </w:r>
     </w:p>
     <w:p>
@@ -1613,7 +2219,21 @@
           <w:lang w:val="en-US"/>
         </w:rPr>
         <w:lastRenderedPageBreak/>
-        <w:t xml:space="preserve">Spacing 9000: En = 61 ; Er = 49.9 ; Em = 14.7 </w:t>
+        <w:t xml:space="preserve">Spacing 9000: En = </w:t>
+      </w:r>
+      <w:proofErr w:type="gramStart"/>
+      <w:r>
+        <w:rPr>
+          <w:lang w:val="en-US"/>
+        </w:rPr>
+        <w:t>61 ;</w:t>
+      </w:r>
+      <w:proofErr w:type="gramEnd"/>
+      <w:r>
+        <w:rPr>
+          <w:lang w:val="en-US"/>
+        </w:rPr>
+        <w:t xml:space="preserve"> Er = 49.9 ; Em = 14.7 </w:t>
       </w:r>
     </w:p>
     <w:p>
@@ -1649,7 +2269,21 @@
         <w:rPr>
           <w:lang w:val="en-US"/>
         </w:rPr>
-        <w:t xml:space="preserve">Spacing 4500: En = 25.2; Er = 168.7 ; Em = 154.4 </w:t>
+        <w:t xml:space="preserve">Spacing 4500: En = 25.2; Er = </w:t>
+      </w:r>
+      <w:proofErr w:type="gramStart"/>
+      <w:r>
+        <w:rPr>
+          <w:lang w:val="en-US"/>
+        </w:rPr>
+        <w:t>168.7 ;</w:t>
+      </w:r>
+      <w:proofErr w:type="gramEnd"/>
+      <w:r>
+        <w:rPr>
+          <w:lang w:val="en-US"/>
+        </w:rPr>
+        <w:t xml:space="preserve"> Em = 154.4 </w:t>
       </w:r>
     </w:p>
     <w:p>
@@ -1667,22 +2301,1484 @@
         <w:rPr>
           <w:lang w:val="en-US"/>
         </w:rPr>
-        <w:t xml:space="preserve">Spacing 9000: En = 53.8 ; Er = 140.1 ; Em = 107.6 </w:t>
-      </w:r>
-    </w:p>
-    <w:p>
-      <w:pPr>
-        <w:rPr>
-          <w:lang w:val="en-US"/>
-        </w:rPr>
-      </w:pPr>
-    </w:p>
-    <w:p>
-      <w:pPr>
-        <w:rPr>
-          <w:lang w:val="en-US"/>
-        </w:rPr>
-      </w:pPr>
+        <w:t xml:space="preserve">Spacing 9000: En = </w:t>
+      </w:r>
+      <w:proofErr w:type="gramStart"/>
+      <w:r>
+        <w:rPr>
+          <w:lang w:val="en-US"/>
+        </w:rPr>
+        <w:t>53.8 ;</w:t>
+      </w:r>
+      <w:proofErr w:type="gramEnd"/>
+      <w:r>
+        <w:rPr>
+          <w:lang w:val="en-US"/>
+        </w:rPr>
+        <w:t xml:space="preserve"> Er = 140.1 ; Em = 107.6 </w:t>
+      </w:r>
+    </w:p>
+    <w:p>
+      <w:pPr>
+        <w:rPr>
+          <w:lang w:val="en-US"/>
+        </w:rPr>
+      </w:pPr>
+    </w:p>
+    <w:p>
+      <w:pPr>
+        <w:rPr>
+          <w:lang w:val="en-US"/>
+        </w:rPr>
+      </w:pPr>
+    </w:p>
+    <w:p>
+      <w:pPr>
+        <w:rPr>
+          <w:lang w:val="en-US"/>
+        </w:rPr>
+      </w:pPr>
+    </w:p>
+    <w:p>
+      <w:pPr>
+        <w:rPr>
+          <w:lang w:val="en-US"/>
+        </w:rPr>
+      </w:pPr>
+    </w:p>
+    <w:p>
+      <w:pPr>
+        <w:rPr>
+          <w:lang w:val="en-US"/>
+        </w:rPr>
+      </w:pPr>
+      <w:r>
+        <w:rPr>
+          <w:lang w:val="en-US"/>
+        </w:rPr>
+        <w:t>CLT parameters</w:t>
+      </w:r>
+      <w:r>
+        <w:rPr>
+          <w:lang w:val="en-US"/>
+        </w:rPr>
+        <w:t xml:space="preserve"> – September 2024</w:t>
+      </w:r>
+    </w:p>
+    <w:p>
+      <w:pPr>
+        <w:rPr>
+          <w:lang w:val="en-US"/>
+        </w:rPr>
+      </w:pPr>
+    </w:p>
+    <w:p>
+      <w:pPr>
+        <w:rPr>
+          <w:lang w:val="en-US"/>
+        </w:rPr>
+      </w:pPr>
+      <w:proofErr w:type="spellStart"/>
+      <w:r>
+        <w:rPr>
+          <w:lang w:val="en-US"/>
+        </w:rPr>
+        <w:t>MsigmaFactor</w:t>
+      </w:r>
+      <w:proofErr w:type="spellEnd"/>
+      <w:r>
+        <w:rPr>
+          <w:lang w:val="en-US"/>
+        </w:rPr>
+        <w:t xml:space="preserve"> = 3 #male to female sigma</w:t>
+      </w:r>
+    </w:p>
+    <w:p>
+      <w:pPr>
+        <w:rPr>
+          <w:lang w:val="en-US"/>
+        </w:rPr>
+      </w:pPr>
+      <w:proofErr w:type="spellStart"/>
+      <w:r>
+        <w:rPr>
+          <w:lang w:val="en-US"/>
+        </w:rPr>
+        <w:t>MDFactor</w:t>
+      </w:r>
+      <w:proofErr w:type="spellEnd"/>
+      <w:r>
+        <w:rPr>
+          <w:lang w:val="en-US"/>
+        </w:rPr>
+        <w:t xml:space="preserve"> = </w:t>
+      </w:r>
+      <w:proofErr w:type="gramStart"/>
+      <w:r>
+        <w:rPr>
+          <w:lang w:val="en-US"/>
+        </w:rPr>
+        <w:t>0.875  #</w:t>
+      </w:r>
+      <w:proofErr w:type="gramEnd"/>
+      <w:r>
+        <w:rPr>
+          <w:lang w:val="en-US"/>
+        </w:rPr>
+        <w:t>male to female D</w:t>
+      </w:r>
+    </w:p>
+    <w:p>
+      <w:pPr>
+        <w:rPr>
+          <w:lang w:val="en-US"/>
+        </w:rPr>
+      </w:pPr>
+    </w:p>
+    <w:p>
+      <w:pPr>
+        <w:rPr>
+          <w:lang w:val="en-US"/>
+        </w:rPr>
+      </w:pPr>
+      <w:proofErr w:type="spellStart"/>
+      <w:r>
+        <w:rPr>
+          <w:lang w:val="en-US"/>
+        </w:rPr>
+        <w:t>sigmaF</w:t>
+      </w:r>
+      <w:proofErr w:type="spellEnd"/>
+      <w:r>
+        <w:rPr>
+          <w:lang w:val="en-US"/>
+        </w:rPr>
+        <w:t xml:space="preserve"> = </w:t>
+      </w:r>
+      <w:proofErr w:type="gramStart"/>
+      <w:r>
+        <w:rPr>
+          <w:lang w:val="en-US"/>
+        </w:rPr>
+        <w:t>2000 ;</w:t>
+      </w:r>
+      <w:proofErr w:type="gramEnd"/>
+      <w:r>
+        <w:rPr>
+          <w:lang w:val="en-US"/>
+        </w:rPr>
+        <w:t xml:space="preserve"> </w:t>
+      </w:r>
+      <w:proofErr w:type="spellStart"/>
+      <w:r>
+        <w:rPr>
+          <w:lang w:val="en-US"/>
+        </w:rPr>
+        <w:t>sigmaM</w:t>
+      </w:r>
+      <w:proofErr w:type="spellEnd"/>
+      <w:r>
+        <w:rPr>
+          <w:lang w:val="en-US"/>
+        </w:rPr>
+        <w:t xml:space="preserve"> = </w:t>
+      </w:r>
+      <w:proofErr w:type="spellStart"/>
+      <w:r>
+        <w:rPr>
+          <w:lang w:val="en-US"/>
+        </w:rPr>
+        <w:t>MsigmaFactor</w:t>
+      </w:r>
+      <w:proofErr w:type="spellEnd"/>
+      <w:r>
+        <w:rPr>
+          <w:lang w:val="en-US"/>
+        </w:rPr>
+        <w:t xml:space="preserve"> * </w:t>
+      </w:r>
+      <w:proofErr w:type="spellStart"/>
+      <w:r>
+        <w:rPr>
+          <w:lang w:val="en-US"/>
+        </w:rPr>
+        <w:t>sigmaF</w:t>
+      </w:r>
+      <w:proofErr w:type="spellEnd"/>
+      <w:r>
+        <w:rPr>
+          <w:lang w:val="en-US"/>
+        </w:rPr>
+        <w:t xml:space="preserve"> ; sigma &lt;- c(</w:t>
+      </w:r>
+      <w:proofErr w:type="spellStart"/>
+      <w:r>
+        <w:rPr>
+          <w:lang w:val="en-US"/>
+        </w:rPr>
+        <w:t>sigmaF</w:t>
+      </w:r>
+      <w:proofErr w:type="spellEnd"/>
+      <w:r>
+        <w:rPr>
+          <w:lang w:val="en-US"/>
+        </w:rPr>
+        <w:t xml:space="preserve">, </w:t>
+      </w:r>
+      <w:proofErr w:type="spellStart"/>
+      <w:r>
+        <w:rPr>
+          <w:lang w:val="en-US"/>
+        </w:rPr>
+        <w:t>sigmaM</w:t>
+      </w:r>
+      <w:proofErr w:type="spellEnd"/>
+      <w:r>
+        <w:rPr>
+          <w:lang w:val="en-US"/>
+        </w:rPr>
+        <w:t>)</w:t>
+      </w:r>
+    </w:p>
+    <w:p>
+      <w:pPr>
+        <w:rPr>
+          <w:lang w:val="de-DE"/>
+        </w:rPr>
+      </w:pPr>
+      <w:r>
+        <w:rPr>
+          <w:lang w:val="de-DE"/>
+        </w:rPr>
+        <w:t>DF = 0.00008 ; DM = MDFactor * DF ; D &lt;- c(DF, DM)</w:t>
+      </w:r>
+    </w:p>
+    <w:p>
+      <w:pPr>
+        <w:rPr>
+          <w:lang w:val="it-IT"/>
+        </w:rPr>
+      </w:pPr>
+      <w:r>
+        <w:rPr>
+          <w:lang w:val="it-IT"/>
+        </w:rPr>
+        <w:t xml:space="preserve">lambda0F = 6 ; lambda0M = 3 ; lambda0 &lt;- c(lambda0F,lambda0M) </w:t>
+      </w:r>
+    </w:p>
+    <w:p>
+      <w:pPr>
+        <w:rPr>
+          <w:lang w:val="en-US"/>
+        </w:rPr>
+      </w:pPr>
+      <w:proofErr w:type="spellStart"/>
+      <w:r>
+        <w:rPr>
+          <w:lang w:val="en-US"/>
+        </w:rPr>
+        <w:t>nT</w:t>
+      </w:r>
+      <w:proofErr w:type="spellEnd"/>
+      <w:r>
+        <w:rPr>
+          <w:lang w:val="en-US"/>
+        </w:rPr>
+        <w:t xml:space="preserve"> &lt;- 40</w:t>
+      </w:r>
+    </w:p>
+    <w:p>
+      <w:pPr>
+        <w:rPr>
+          <w:lang w:val="en-US"/>
+        </w:rPr>
+      </w:pPr>
+    </w:p>
+    <w:p>
+      <w:pPr>
+        <w:rPr>
+          <w:lang w:val="en-US"/>
+        </w:rPr>
+      </w:pPr>
+      <w:r>
+        <w:rPr>
+          <w:lang w:val="en-US"/>
+        </w:rPr>
+        <w:t>Summaries of data</w:t>
+      </w:r>
+    </w:p>
+    <w:p>
+      <w:pPr>
+        <w:rPr>
+          <w:lang w:val="en-US"/>
+        </w:rPr>
+      </w:pPr>
+    </w:p>
+    <w:p>
+      <w:pPr>
+        <w:rPr>
+          <w:lang w:val="en-US"/>
+        </w:rPr>
+      </w:pPr>
+      <w:r>
+        <w:rPr>
+          <w:lang w:val="en-US"/>
+        </w:rPr>
+        <w:t>Grid with 2*F sigma (2/3 M sig)</w:t>
+      </w:r>
+    </w:p>
+    <w:p>
+      <w:pPr>
+        <w:pStyle w:val="ListParagraph"/>
+        <w:numPr>
+          <w:ilvl w:val="0"/>
+          <w:numId w:val="3"/>
+        </w:numPr>
+        <w:rPr>
+          <w:lang w:val="en-US"/>
+        </w:rPr>
+      </w:pPr>
+      <w:r>
+        <w:rPr>
+          <w:lang w:val="en-US"/>
+        </w:rPr>
+        <w:t xml:space="preserve">F: 6.7 </w:t>
+      </w:r>
+      <w:proofErr w:type="spellStart"/>
+      <w:r>
+        <w:rPr>
+          <w:lang w:val="en-US"/>
+        </w:rPr>
+        <w:t>inds</w:t>
+      </w:r>
+      <w:proofErr w:type="spellEnd"/>
+      <w:r>
+        <w:rPr>
+          <w:lang w:val="en-US"/>
+        </w:rPr>
+        <w:t xml:space="preserve"> with 41.1 recaps and about 11 SRCs</w:t>
+      </w:r>
+    </w:p>
+    <w:p>
+      <w:pPr>
+        <w:pStyle w:val="ListParagraph"/>
+        <w:numPr>
+          <w:ilvl w:val="0"/>
+          <w:numId w:val="3"/>
+        </w:numPr>
+        <w:rPr>
+          <w:lang w:val="en-US"/>
+        </w:rPr>
+      </w:pPr>
+      <w:r>
+        <w:rPr>
+          <w:lang w:val="en-US"/>
+        </w:rPr>
+        <w:t xml:space="preserve">M: 15.1 </w:t>
+      </w:r>
+      <w:proofErr w:type="spellStart"/>
+      <w:r>
+        <w:rPr>
+          <w:lang w:val="en-US"/>
+        </w:rPr>
+        <w:t>inds</w:t>
+      </w:r>
+      <w:proofErr w:type="spellEnd"/>
+      <w:r>
+        <w:rPr>
+          <w:lang w:val="en-US"/>
+        </w:rPr>
+        <w:t xml:space="preserve"> 160.4 recaps, 85.1 SRCS</w:t>
+      </w:r>
+    </w:p>
+    <w:p>
+      <w:pPr>
+        <w:rPr>
+          <w:lang w:val="en-US"/>
+        </w:rPr>
+      </w:pPr>
+    </w:p>
+    <w:p>
+      <w:pPr>
+        <w:rPr>
+          <w:lang w:val="en-US"/>
+        </w:rPr>
+      </w:pPr>
+      <w:r>
+        <w:rPr>
+          <w:lang w:val="en-US"/>
+        </w:rPr>
+        <w:t>Grid with 2*M sigma (6 F sig)</w:t>
+      </w:r>
+    </w:p>
+    <w:p>
+      <w:pPr>
+        <w:pStyle w:val="ListParagraph"/>
+        <w:numPr>
+          <w:ilvl w:val="0"/>
+          <w:numId w:val="4"/>
+        </w:numPr>
+        <w:rPr>
+          <w:lang w:val="en-US"/>
+        </w:rPr>
+      </w:pPr>
+      <w:r>
+        <w:rPr>
+          <w:lang w:val="en-US"/>
+        </w:rPr>
+        <w:t xml:space="preserve">F: 19.8 </w:t>
+      </w:r>
+      <w:proofErr w:type="spellStart"/>
+      <w:r>
+        <w:rPr>
+          <w:lang w:val="en-US"/>
+        </w:rPr>
+        <w:t>inds</w:t>
+      </w:r>
+      <w:proofErr w:type="spellEnd"/>
+      <w:r>
+        <w:rPr>
+          <w:lang w:val="en-US"/>
+        </w:rPr>
+        <w:t xml:space="preserve"> with 29.6 recaps and 0.04 SRCs</w:t>
+      </w:r>
+    </w:p>
+    <w:p>
+      <w:pPr>
+        <w:pStyle w:val="ListParagraph"/>
+        <w:numPr>
+          <w:ilvl w:val="0"/>
+          <w:numId w:val="4"/>
+        </w:numPr>
+        <w:rPr>
+          <w:lang w:val="en-US"/>
+        </w:rPr>
+      </w:pPr>
+      <w:r>
+        <w:rPr>
+          <w:lang w:val="en-US"/>
+        </w:rPr>
+        <w:t xml:space="preserve">M: 51.9 </w:t>
+      </w:r>
+      <w:proofErr w:type="spellStart"/>
+      <w:r>
+        <w:rPr>
+          <w:lang w:val="en-US"/>
+        </w:rPr>
+        <w:t>inds</w:t>
+      </w:r>
+      <w:proofErr w:type="spellEnd"/>
+      <w:r>
+        <w:rPr>
+          <w:lang w:val="en-US"/>
+        </w:rPr>
+        <w:t xml:space="preserve"> 140.9 recaps, 56.1 SRCS</w:t>
+      </w:r>
+    </w:p>
+    <w:p>
+      <w:pPr>
+        <w:rPr>
+          <w:lang w:val="en-US"/>
+        </w:rPr>
+      </w:pPr>
+    </w:p>
+    <w:p>
+      <w:pPr>
+        <w:rPr>
+          <w:lang w:val="en-US"/>
+        </w:rPr>
+      </w:pPr>
+      <w:r>
+        <w:rPr>
+          <w:lang w:val="en-US"/>
+        </w:rPr>
+        <w:t xml:space="preserve">Grid with Avg sigma (1.3 * M </w:t>
+      </w:r>
+      <w:proofErr w:type="gramStart"/>
+      <w:r>
+        <w:rPr>
+          <w:lang w:val="en-US"/>
+        </w:rPr>
+        <w:t>sig ;</w:t>
+      </w:r>
+      <w:proofErr w:type="gramEnd"/>
+      <w:r>
+        <w:rPr>
+          <w:lang w:val="en-US"/>
+        </w:rPr>
+        <w:t xml:space="preserve"> 4 F sigma)</w:t>
+      </w:r>
+    </w:p>
+    <w:p>
+      <w:pPr>
+        <w:pStyle w:val="ListParagraph"/>
+        <w:numPr>
+          <w:ilvl w:val="0"/>
+          <w:numId w:val="6"/>
+        </w:numPr>
+        <w:rPr>
+          <w:lang w:val="en-US"/>
+        </w:rPr>
+      </w:pPr>
+      <w:r>
+        <w:rPr>
+          <w:lang w:val="en-US"/>
+        </w:rPr>
+        <w:t xml:space="preserve">F: 16.9 </w:t>
+      </w:r>
+      <w:proofErr w:type="spellStart"/>
+      <w:r>
+        <w:rPr>
+          <w:lang w:val="en-US"/>
+        </w:rPr>
+        <w:t>inds</w:t>
+      </w:r>
+      <w:proofErr w:type="spellEnd"/>
+      <w:r>
+        <w:rPr>
+          <w:lang w:val="en-US"/>
+        </w:rPr>
+        <w:t xml:space="preserve"> with 31.7 recaps and 1.95 SRCs</w:t>
+      </w:r>
+    </w:p>
+    <w:p>
+      <w:pPr>
+        <w:pStyle w:val="ListParagraph"/>
+        <w:numPr>
+          <w:ilvl w:val="0"/>
+          <w:numId w:val="6"/>
+        </w:numPr>
+        <w:rPr>
+          <w:lang w:val="en-US"/>
+        </w:rPr>
+      </w:pPr>
+      <w:r>
+        <w:rPr>
+          <w:lang w:val="en-US"/>
+        </w:rPr>
+        <w:t xml:space="preserve">M: 30.9 </w:t>
+      </w:r>
+      <w:proofErr w:type="spellStart"/>
+      <w:r>
+        <w:rPr>
+          <w:lang w:val="en-US"/>
+        </w:rPr>
+        <w:t>inds</w:t>
+      </w:r>
+      <w:proofErr w:type="spellEnd"/>
+      <w:r>
+        <w:rPr>
+          <w:lang w:val="en-US"/>
+        </w:rPr>
+        <w:t xml:space="preserve"> 155.3 recaps, 75 SRCS</w:t>
+      </w:r>
+    </w:p>
+    <w:p>
+      <w:pPr>
+        <w:rPr>
+          <w:lang w:val="en-US"/>
+        </w:rPr>
+      </w:pPr>
+    </w:p>
+    <w:p>
+      <w:pPr>
+        <w:rPr>
+          <w:lang w:val="en-US"/>
+        </w:rPr>
+      </w:pPr>
+      <w:r>
+        <w:rPr>
+          <w:lang w:val="en-US"/>
+        </w:rPr>
+        <w:t>GA 4 (space filling) with F pars</w:t>
+      </w:r>
+    </w:p>
+    <w:p>
+      <w:pPr>
+        <w:pStyle w:val="ListParagraph"/>
+        <w:numPr>
+          <w:ilvl w:val="0"/>
+          <w:numId w:val="6"/>
+        </w:numPr>
+        <w:rPr>
+          <w:lang w:val="en-US"/>
+        </w:rPr>
+      </w:pPr>
+      <w:r>
+        <w:rPr>
+          <w:lang w:val="en-US"/>
+        </w:rPr>
+        <w:t xml:space="preserve">F: 18.8 </w:t>
+      </w:r>
+      <w:proofErr w:type="spellStart"/>
+      <w:r>
+        <w:rPr>
+          <w:lang w:val="en-US"/>
+        </w:rPr>
+        <w:t>inds</w:t>
+      </w:r>
+      <w:proofErr w:type="spellEnd"/>
+      <w:r>
+        <w:rPr>
+          <w:lang w:val="en-US"/>
+        </w:rPr>
+        <w:t xml:space="preserve"> with 29.4 recaps and 0.2 SRCs</w:t>
+      </w:r>
+    </w:p>
+    <w:p>
+      <w:pPr>
+        <w:pStyle w:val="ListParagraph"/>
+        <w:numPr>
+          <w:ilvl w:val="0"/>
+          <w:numId w:val="6"/>
+        </w:numPr>
+        <w:rPr>
+          <w:lang w:val="en-US"/>
+        </w:rPr>
+      </w:pPr>
+      <w:r>
+        <w:rPr>
+          <w:lang w:val="en-US"/>
+        </w:rPr>
+        <w:t xml:space="preserve">M: 65.8 </w:t>
+      </w:r>
+      <w:proofErr w:type="spellStart"/>
+      <w:r>
+        <w:rPr>
+          <w:lang w:val="en-US"/>
+        </w:rPr>
+        <w:t>inds</w:t>
+      </w:r>
+      <w:proofErr w:type="spellEnd"/>
+      <w:r>
+        <w:rPr>
+          <w:lang w:val="en-US"/>
+        </w:rPr>
+        <w:t xml:space="preserve"> 124.2 recaps, 41.4 SRCS</w:t>
+      </w:r>
+    </w:p>
+    <w:p>
+      <w:pPr>
+        <w:rPr>
+          <w:lang w:val="en-US"/>
+        </w:rPr>
+      </w:pPr>
+    </w:p>
+    <w:p>
+      <w:pPr>
+        <w:rPr>
+          <w:lang w:val="en-US"/>
+        </w:rPr>
+      </w:pPr>
+      <w:r>
+        <w:rPr>
+          <w:lang w:val="en-US"/>
+        </w:rPr>
+        <w:t>GA 4 (space filling) with M pars</w:t>
+      </w:r>
+    </w:p>
+    <w:p>
+      <w:pPr>
+        <w:pStyle w:val="ListParagraph"/>
+        <w:numPr>
+          <w:ilvl w:val="0"/>
+          <w:numId w:val="6"/>
+        </w:numPr>
+        <w:rPr>
+          <w:lang w:val="en-US"/>
+        </w:rPr>
+      </w:pPr>
+      <w:r>
+        <w:rPr>
+          <w:lang w:val="en-US"/>
+        </w:rPr>
+        <w:t xml:space="preserve">F: 18.1 </w:t>
+      </w:r>
+      <w:proofErr w:type="spellStart"/>
+      <w:r>
+        <w:rPr>
+          <w:lang w:val="en-US"/>
+        </w:rPr>
+        <w:t>inds</w:t>
+      </w:r>
+      <w:proofErr w:type="spellEnd"/>
+      <w:r>
+        <w:rPr>
+          <w:lang w:val="en-US"/>
+        </w:rPr>
+        <w:t xml:space="preserve"> with 30.3 recaps and 0.9 SRCs</w:t>
+      </w:r>
+    </w:p>
+    <w:p>
+      <w:pPr>
+        <w:pStyle w:val="ListParagraph"/>
+        <w:numPr>
+          <w:ilvl w:val="0"/>
+          <w:numId w:val="5"/>
+        </w:numPr>
+        <w:rPr>
+          <w:lang w:val="en-US"/>
+        </w:rPr>
+      </w:pPr>
+      <w:r>
+        <w:rPr>
+          <w:lang w:val="en-US"/>
+        </w:rPr>
+        <w:t xml:space="preserve">M: 69.2 </w:t>
+      </w:r>
+      <w:proofErr w:type="spellStart"/>
+      <w:r>
+        <w:rPr>
+          <w:lang w:val="en-US"/>
+        </w:rPr>
+        <w:t>inds</w:t>
+      </w:r>
+      <w:proofErr w:type="spellEnd"/>
+      <w:r>
+        <w:rPr>
+          <w:lang w:val="en-US"/>
+        </w:rPr>
+        <w:t xml:space="preserve"> 122.4 recaps, 37.5 SRCS</w:t>
+      </w:r>
+    </w:p>
+    <w:p>
+      <w:pPr>
+        <w:rPr>
+          <w:lang w:val="en-US"/>
+        </w:rPr>
+      </w:pPr>
+    </w:p>
+    <w:p>
+      <w:pPr>
+        <w:rPr>
+          <w:lang w:val="en-US"/>
+        </w:rPr>
+      </w:pPr>
+      <w:r>
+        <w:rPr>
+          <w:lang w:val="en-US"/>
+        </w:rPr>
+        <w:t>GA 4 (space filling) with Avg pars</w:t>
+      </w:r>
+    </w:p>
+    <w:p>
+      <w:pPr>
+        <w:pStyle w:val="ListParagraph"/>
+        <w:numPr>
+          <w:ilvl w:val="0"/>
+          <w:numId w:val="6"/>
+        </w:numPr>
+        <w:rPr>
+          <w:lang w:val="en-US"/>
+        </w:rPr>
+      </w:pPr>
+      <w:r>
+        <w:rPr>
+          <w:lang w:val="en-US"/>
+        </w:rPr>
+        <w:t xml:space="preserve">F: 18.4 </w:t>
+      </w:r>
+      <w:proofErr w:type="spellStart"/>
+      <w:r>
+        <w:rPr>
+          <w:lang w:val="en-US"/>
+        </w:rPr>
+        <w:t>inds</w:t>
+      </w:r>
+      <w:proofErr w:type="spellEnd"/>
+      <w:r>
+        <w:rPr>
+          <w:lang w:val="en-US"/>
+        </w:rPr>
+        <w:t xml:space="preserve"> with 30.5 recaps and 0.8 SRCs</w:t>
+      </w:r>
+    </w:p>
+    <w:p>
+      <w:pPr>
+        <w:pStyle w:val="ListParagraph"/>
+        <w:numPr>
+          <w:ilvl w:val="0"/>
+          <w:numId w:val="5"/>
+        </w:numPr>
+        <w:rPr>
+          <w:lang w:val="en-US"/>
+        </w:rPr>
+      </w:pPr>
+      <w:r>
+        <w:rPr>
+          <w:lang w:val="en-US"/>
+        </w:rPr>
+        <w:t xml:space="preserve">M: 67.8 </w:t>
+      </w:r>
+      <w:proofErr w:type="spellStart"/>
+      <w:r>
+        <w:rPr>
+          <w:lang w:val="en-US"/>
+        </w:rPr>
+        <w:t>inds</w:t>
+      </w:r>
+      <w:proofErr w:type="spellEnd"/>
+      <w:r>
+        <w:rPr>
+          <w:lang w:val="en-US"/>
+        </w:rPr>
+        <w:t xml:space="preserve"> 120.3 recaps, 37.8 SRCS</w:t>
+      </w:r>
+    </w:p>
+    <w:p>
+      <w:pPr>
+        <w:rPr>
+          <w:lang w:val="en-US"/>
+        </w:rPr>
+      </w:pPr>
+    </w:p>
+    <w:p>
+      <w:pPr>
+        <w:rPr>
+          <w:lang w:val="en-US"/>
+        </w:rPr>
+      </w:pPr>
+      <w:r>
+        <w:rPr>
+          <w:lang w:val="en-US"/>
+        </w:rPr>
+        <w:t>GA 4 (space filling) with both pars</w:t>
+      </w:r>
+    </w:p>
+    <w:p>
+      <w:pPr>
+        <w:pStyle w:val="ListParagraph"/>
+        <w:numPr>
+          <w:ilvl w:val="0"/>
+          <w:numId w:val="6"/>
+        </w:numPr>
+        <w:rPr>
+          <w:lang w:val="en-US"/>
+        </w:rPr>
+      </w:pPr>
+      <w:r>
+        <w:rPr>
+          <w:lang w:val="en-US"/>
+        </w:rPr>
+        <w:t xml:space="preserve">F: 17.5 </w:t>
+      </w:r>
+      <w:proofErr w:type="spellStart"/>
+      <w:r>
+        <w:rPr>
+          <w:lang w:val="en-US"/>
+        </w:rPr>
+        <w:t>inds</w:t>
+      </w:r>
+      <w:proofErr w:type="spellEnd"/>
+      <w:r>
+        <w:rPr>
+          <w:lang w:val="en-US"/>
+        </w:rPr>
+        <w:t xml:space="preserve"> with 30.3 recaps and 1.4 SRCs</w:t>
+      </w:r>
+    </w:p>
+    <w:p>
+      <w:pPr>
+        <w:pStyle w:val="ListParagraph"/>
+        <w:numPr>
+          <w:ilvl w:val="0"/>
+          <w:numId w:val="6"/>
+        </w:numPr>
+        <w:rPr>
+          <w:lang w:val="en-US"/>
+        </w:rPr>
+      </w:pPr>
+      <w:r>
+        <w:rPr>
+          <w:lang w:val="en-US"/>
+        </w:rPr>
+        <w:t xml:space="preserve">M: 68.9 </w:t>
+      </w:r>
+      <w:proofErr w:type="spellStart"/>
+      <w:r>
+        <w:rPr>
+          <w:lang w:val="en-US"/>
+        </w:rPr>
+        <w:t>inds</w:t>
+      </w:r>
+      <w:proofErr w:type="spellEnd"/>
+      <w:r>
+        <w:rPr>
+          <w:lang w:val="en-US"/>
+        </w:rPr>
+        <w:t xml:space="preserve"> 122.7 recaps, 38.7 SRCS</w:t>
+      </w:r>
+    </w:p>
+    <w:p>
+      <w:pPr>
+        <w:rPr>
+          <w:lang w:val="en-US"/>
+        </w:rPr>
+      </w:pPr>
+    </w:p>
+    <w:p>
+      <w:pPr>
+        <w:rPr>
+          <w:lang w:val="en-US"/>
+        </w:rPr>
+      </w:pPr>
+      <w:r>
+        <w:rPr>
+          <w:lang w:val="en-US"/>
+        </w:rPr>
+        <w:t>GA 4 (space filling) with both pars Max = T</w:t>
+      </w:r>
+    </w:p>
+    <w:p>
+      <w:pPr>
+        <w:pStyle w:val="ListParagraph"/>
+        <w:numPr>
+          <w:ilvl w:val="0"/>
+          <w:numId w:val="6"/>
+        </w:numPr>
+        <w:rPr>
+          <w:lang w:val="en-US"/>
+        </w:rPr>
+      </w:pPr>
+      <w:r>
+        <w:rPr>
+          <w:lang w:val="en-US"/>
+        </w:rPr>
+        <w:t xml:space="preserve">F: 18.9 </w:t>
+      </w:r>
+      <w:proofErr w:type="spellStart"/>
+      <w:r>
+        <w:rPr>
+          <w:lang w:val="en-US"/>
+        </w:rPr>
+        <w:t>inds</w:t>
+      </w:r>
+      <w:proofErr w:type="spellEnd"/>
+      <w:r>
+        <w:rPr>
+          <w:lang w:val="en-US"/>
+        </w:rPr>
+        <w:t xml:space="preserve"> with 28.5 recaps and 0.2 SRCs</w:t>
+      </w:r>
+    </w:p>
+    <w:p>
+      <w:pPr>
+        <w:pStyle w:val="ListParagraph"/>
+        <w:numPr>
+          <w:ilvl w:val="0"/>
+          <w:numId w:val="6"/>
+        </w:numPr>
+        <w:rPr>
+          <w:lang w:val="en-US"/>
+        </w:rPr>
+      </w:pPr>
+      <w:r>
+        <w:rPr>
+          <w:lang w:val="en-US"/>
+        </w:rPr>
+        <w:t xml:space="preserve">M: 64.8 </w:t>
+      </w:r>
+      <w:proofErr w:type="spellStart"/>
+      <w:r>
+        <w:rPr>
+          <w:lang w:val="en-US"/>
+        </w:rPr>
+        <w:t>inds</w:t>
+      </w:r>
+      <w:proofErr w:type="spellEnd"/>
+      <w:r>
+        <w:rPr>
+          <w:lang w:val="en-US"/>
+        </w:rPr>
+        <w:t xml:space="preserve"> 125.4 recaps, 41.4 SRCS</w:t>
+      </w:r>
+    </w:p>
+    <w:p>
+      <w:pPr>
+        <w:rPr>
+          <w:lang w:val="en-US"/>
+        </w:rPr>
+      </w:pPr>
+    </w:p>
+    <w:p>
+      <w:pPr>
+        <w:rPr>
+          <w:lang w:val="en-US"/>
+        </w:rPr>
+      </w:pPr>
+      <w:r>
+        <w:rPr>
+          <w:lang w:val="en-US"/>
+        </w:rPr>
+        <w:t>GA 5 (cluster) with F pars</w:t>
+      </w:r>
+    </w:p>
+    <w:p>
+      <w:pPr>
+        <w:pStyle w:val="ListParagraph"/>
+        <w:numPr>
+          <w:ilvl w:val="0"/>
+          <w:numId w:val="6"/>
+        </w:numPr>
+        <w:rPr>
+          <w:lang w:val="en-US"/>
+        </w:rPr>
+      </w:pPr>
+      <w:r>
+        <w:rPr>
+          <w:lang w:val="en-US"/>
+        </w:rPr>
+        <w:t xml:space="preserve">F: 11.8 </w:t>
+      </w:r>
+      <w:proofErr w:type="spellStart"/>
+      <w:r>
+        <w:rPr>
+          <w:lang w:val="en-US"/>
+        </w:rPr>
+        <w:t>inds</w:t>
+      </w:r>
+      <w:proofErr w:type="spellEnd"/>
+      <w:r>
+        <w:rPr>
+          <w:lang w:val="en-US"/>
+        </w:rPr>
+        <w:t xml:space="preserve"> with 35.9 recaps and 7.3 SRCs</w:t>
+      </w:r>
+    </w:p>
+    <w:p>
+      <w:pPr>
+        <w:pStyle w:val="ListParagraph"/>
+        <w:numPr>
+          <w:ilvl w:val="0"/>
+          <w:numId w:val="6"/>
+        </w:numPr>
+        <w:rPr>
+          <w:lang w:val="en-US"/>
+        </w:rPr>
+      </w:pPr>
+      <w:r>
+        <w:rPr>
+          <w:lang w:val="en-US"/>
+        </w:rPr>
+        <w:t xml:space="preserve">M: 36.6 </w:t>
+      </w:r>
+      <w:proofErr w:type="spellStart"/>
+      <w:r>
+        <w:rPr>
+          <w:lang w:val="en-US"/>
+        </w:rPr>
+        <w:t>inds</w:t>
+      </w:r>
+      <w:proofErr w:type="spellEnd"/>
+      <w:r>
+        <w:rPr>
+          <w:lang w:val="en-US"/>
+        </w:rPr>
+        <w:t xml:space="preserve"> 158.9 recaps, 72.3 SRCS</w:t>
+      </w:r>
+    </w:p>
+    <w:p>
+      <w:pPr>
+        <w:rPr>
+          <w:lang w:val="en-US"/>
+        </w:rPr>
+      </w:pPr>
+    </w:p>
+    <w:p>
+      <w:pPr>
+        <w:rPr>
+          <w:lang w:val="en-US"/>
+        </w:rPr>
+      </w:pPr>
+      <w:r>
+        <w:rPr>
+          <w:lang w:val="en-US"/>
+        </w:rPr>
+        <w:t>GA 5 (cluster) with M pars</w:t>
+      </w:r>
+    </w:p>
+    <w:p>
+      <w:pPr>
+        <w:pStyle w:val="ListParagraph"/>
+        <w:numPr>
+          <w:ilvl w:val="0"/>
+          <w:numId w:val="6"/>
+        </w:numPr>
+        <w:rPr>
+          <w:lang w:val="en-US"/>
+        </w:rPr>
+      </w:pPr>
+      <w:r>
+        <w:rPr>
+          <w:lang w:val="en-US"/>
+        </w:rPr>
+        <w:t xml:space="preserve">F: 17.2 </w:t>
+      </w:r>
+      <w:proofErr w:type="spellStart"/>
+      <w:r>
+        <w:rPr>
+          <w:lang w:val="en-US"/>
+        </w:rPr>
+        <w:t>inds</w:t>
+      </w:r>
+      <w:proofErr w:type="spellEnd"/>
+      <w:r>
+        <w:rPr>
+          <w:lang w:val="en-US"/>
+        </w:rPr>
+        <w:t xml:space="preserve"> with 30.9 recaps and 2 SRCs</w:t>
+      </w:r>
+    </w:p>
+    <w:p>
+      <w:pPr>
+        <w:pStyle w:val="ListParagraph"/>
+        <w:numPr>
+          <w:ilvl w:val="0"/>
+          <w:numId w:val="6"/>
+        </w:numPr>
+        <w:rPr>
+          <w:lang w:val="en-US"/>
+        </w:rPr>
+      </w:pPr>
+      <w:r>
+        <w:rPr>
+          <w:lang w:val="en-US"/>
+        </w:rPr>
+        <w:t xml:space="preserve">M: 57.4 </w:t>
+      </w:r>
+      <w:proofErr w:type="spellStart"/>
+      <w:r>
+        <w:rPr>
+          <w:lang w:val="en-US"/>
+        </w:rPr>
+        <w:t>inds</w:t>
+      </w:r>
+      <w:proofErr w:type="spellEnd"/>
+      <w:r>
+        <w:rPr>
+          <w:lang w:val="en-US"/>
+        </w:rPr>
+        <w:t xml:space="preserve"> 131.5 recaps, 47.9 SRCS</w:t>
+      </w:r>
+    </w:p>
+    <w:p>
+      <w:pPr>
+        <w:rPr>
+          <w:lang w:val="en-US"/>
+        </w:rPr>
+      </w:pPr>
+    </w:p>
+    <w:p>
+      <w:pPr>
+        <w:rPr>
+          <w:lang w:val="en-US"/>
+        </w:rPr>
+      </w:pPr>
+      <w:r>
+        <w:rPr>
+          <w:lang w:val="en-US"/>
+        </w:rPr>
+        <w:t>GA 5 (cluster) with Avg pars</w:t>
+      </w:r>
+    </w:p>
+    <w:p>
+      <w:pPr>
+        <w:pStyle w:val="ListParagraph"/>
+        <w:numPr>
+          <w:ilvl w:val="0"/>
+          <w:numId w:val="6"/>
+        </w:numPr>
+        <w:rPr>
+          <w:lang w:val="en-US"/>
+        </w:rPr>
+      </w:pPr>
+      <w:r>
+        <w:rPr>
+          <w:lang w:val="en-US"/>
+        </w:rPr>
+        <w:t xml:space="preserve">F: 16 </w:t>
+      </w:r>
+      <w:proofErr w:type="spellStart"/>
+      <w:r>
+        <w:rPr>
+          <w:lang w:val="en-US"/>
+        </w:rPr>
+        <w:t>inds</w:t>
+      </w:r>
+      <w:proofErr w:type="spellEnd"/>
+      <w:r>
+        <w:rPr>
+          <w:lang w:val="en-US"/>
+        </w:rPr>
+        <w:t xml:space="preserve"> with 32.5 recaps and 3.2 SRCs</w:t>
+      </w:r>
+    </w:p>
+    <w:p>
+      <w:pPr>
+        <w:pStyle w:val="ListParagraph"/>
+        <w:numPr>
+          <w:ilvl w:val="0"/>
+          <w:numId w:val="6"/>
+        </w:numPr>
+        <w:rPr>
+          <w:lang w:val="en-US"/>
+        </w:rPr>
+      </w:pPr>
+      <w:r>
+        <w:rPr>
+          <w:lang w:val="en-US"/>
+        </w:rPr>
+        <w:t xml:space="preserve">M: 45.8 </w:t>
+      </w:r>
+      <w:proofErr w:type="spellStart"/>
+      <w:r>
+        <w:rPr>
+          <w:lang w:val="en-US"/>
+        </w:rPr>
+        <w:t>inds</w:t>
+      </w:r>
+      <w:proofErr w:type="spellEnd"/>
+      <w:r>
+        <w:rPr>
+          <w:lang w:val="en-US"/>
+        </w:rPr>
+        <w:t xml:space="preserve"> 148.8 recaps, 62.5 SRCS</w:t>
+      </w:r>
+    </w:p>
+    <w:p>
+      <w:pPr>
+        <w:rPr>
+          <w:lang w:val="en-US"/>
+        </w:rPr>
+      </w:pPr>
+    </w:p>
+    <w:p>
+      <w:pPr>
+        <w:rPr>
+          <w:lang w:val="en-US"/>
+        </w:rPr>
+      </w:pPr>
+      <w:r>
+        <w:rPr>
+          <w:lang w:val="en-US"/>
+        </w:rPr>
+        <w:t>GA 5 (cluster) with both pars</w:t>
+      </w:r>
+    </w:p>
+    <w:p>
+      <w:pPr>
+        <w:pStyle w:val="ListParagraph"/>
+        <w:numPr>
+          <w:ilvl w:val="0"/>
+          <w:numId w:val="6"/>
+        </w:numPr>
+        <w:rPr>
+          <w:lang w:val="en-US"/>
+        </w:rPr>
+      </w:pPr>
+      <w:r>
+        <w:rPr>
+          <w:lang w:val="en-US"/>
+        </w:rPr>
+        <w:t xml:space="preserve">F: 16.1 </w:t>
+      </w:r>
+      <w:proofErr w:type="spellStart"/>
+      <w:r>
+        <w:rPr>
+          <w:lang w:val="en-US"/>
+        </w:rPr>
+        <w:t>inds</w:t>
+      </w:r>
+      <w:proofErr w:type="spellEnd"/>
+      <w:r>
+        <w:rPr>
+          <w:lang w:val="en-US"/>
+        </w:rPr>
+        <w:t xml:space="preserve"> with 32.1 recaps and 3.2 SRCs</w:t>
+      </w:r>
+    </w:p>
+    <w:p>
+      <w:pPr>
+        <w:pStyle w:val="ListParagraph"/>
+        <w:numPr>
+          <w:ilvl w:val="0"/>
+          <w:numId w:val="6"/>
+        </w:numPr>
+        <w:rPr>
+          <w:lang w:val="en-US"/>
+        </w:rPr>
+      </w:pPr>
+      <w:r>
+        <w:rPr>
+          <w:lang w:val="en-US"/>
+        </w:rPr>
+        <w:t xml:space="preserve">M: 55 </w:t>
+      </w:r>
+      <w:proofErr w:type="spellStart"/>
+      <w:r>
+        <w:rPr>
+          <w:lang w:val="en-US"/>
+        </w:rPr>
+        <w:t>inds</w:t>
+      </w:r>
+      <w:proofErr w:type="spellEnd"/>
+      <w:r>
+        <w:rPr>
+          <w:lang w:val="en-US"/>
+        </w:rPr>
+        <w:t xml:space="preserve"> 136.1 recaps, 52.7 SRCS</w:t>
+      </w:r>
+    </w:p>
+    <w:p>
+      <w:pPr>
+        <w:rPr>
+          <w:lang w:val="en-US"/>
+        </w:rPr>
+      </w:pPr>
+    </w:p>
+    <w:p>
+      <w:pPr>
+        <w:rPr>
+          <w:lang w:val="en-US"/>
+        </w:rPr>
+      </w:pPr>
+      <w:r>
+        <w:rPr>
+          <w:lang w:val="en-US"/>
+        </w:rPr>
+        <w:t>GA 5 (cluster) with both pars Max = T</w:t>
+      </w:r>
+    </w:p>
+    <w:p>
+      <w:pPr>
+        <w:pStyle w:val="ListParagraph"/>
+        <w:numPr>
+          <w:ilvl w:val="0"/>
+          <w:numId w:val="6"/>
+        </w:numPr>
+        <w:rPr>
+          <w:lang w:val="en-US"/>
+        </w:rPr>
+      </w:pPr>
+      <w:r>
+        <w:rPr>
+          <w:lang w:val="en-US"/>
+        </w:rPr>
+        <w:t xml:space="preserve">F: 11.8 </w:t>
+      </w:r>
+      <w:proofErr w:type="spellStart"/>
+      <w:r>
+        <w:rPr>
+          <w:lang w:val="en-US"/>
+        </w:rPr>
+        <w:t>inds</w:t>
+      </w:r>
+      <w:proofErr w:type="spellEnd"/>
+      <w:r>
+        <w:rPr>
+          <w:lang w:val="en-US"/>
+        </w:rPr>
+        <w:t xml:space="preserve"> with 35.9 recaps and 7.3 SRCs</w:t>
+      </w:r>
+    </w:p>
+    <w:p>
+      <w:pPr>
+        <w:pStyle w:val="ListParagraph"/>
+        <w:numPr>
+          <w:ilvl w:val="0"/>
+          <w:numId w:val="6"/>
+        </w:numPr>
+        <w:rPr>
+          <w:lang w:val="en-US"/>
+        </w:rPr>
+      </w:pPr>
+      <w:r>
+        <w:rPr>
+          <w:lang w:val="en-US"/>
+        </w:rPr>
+        <w:t xml:space="preserve">M: 36.6 </w:t>
+      </w:r>
+      <w:proofErr w:type="spellStart"/>
+      <w:r>
+        <w:rPr>
+          <w:lang w:val="en-US"/>
+        </w:rPr>
+        <w:t>inds</w:t>
+      </w:r>
+      <w:proofErr w:type="spellEnd"/>
+      <w:r>
+        <w:rPr>
+          <w:lang w:val="en-US"/>
+        </w:rPr>
+        <w:t xml:space="preserve"> 158.9 recaps, 72.3 SRCS</w:t>
+      </w:r>
+    </w:p>
+    <w:p>
+      <w:pPr>
+        <w:rPr>
+          <w:lang w:val="en-US"/>
+        </w:rPr>
+      </w:pPr>
+    </w:p>
+    <w:p>
+      <w:pPr>
+        <w:rPr>
+          <w:lang w:val="en-US"/>
+        </w:rPr>
+      </w:pPr>
+    </w:p>
+    <w:p>
+      <w:pPr>
+        <w:rPr>
+          <w:lang w:val="en-US"/>
+        </w:rPr>
+      </w:pPr>
+      <w:r>
+        <w:rPr>
+          <w:lang w:val="en-US"/>
+        </w:rPr>
+        <w:t>Space filling designs produce very few SRCs for females, as expected clustered designs do better (with F pars or Max = T)</w:t>
+      </w:r>
+    </w:p>
+    <w:p>
+      <w:pPr>
+        <w:rPr>
+          <w:lang w:val="en-US"/>
+        </w:rPr>
+      </w:pPr>
+      <w:r>
+        <w:rPr>
+          <w:lang w:val="en-US"/>
+        </w:rPr>
+        <w:t xml:space="preserve">Big differences between Em and </w:t>
+      </w:r>
+      <w:proofErr w:type="spellStart"/>
+      <w:r>
+        <w:rPr>
+          <w:lang w:val="en-US"/>
+        </w:rPr>
+        <w:t>nmov</w:t>
+      </w:r>
+      <w:proofErr w:type="spellEnd"/>
+      <w:r>
+        <w:rPr>
+          <w:lang w:val="en-US"/>
+        </w:rPr>
+        <w:t xml:space="preserve"> for the grids with Em tended to be much bigger, same pattern but smaller diffs for GA4 (less so for GA5)</w:t>
+      </w:r>
+    </w:p>
+    <w:p>
+      <w:pPr>
+        <w:rPr>
+          <w:lang w:val="en-US"/>
+        </w:rPr>
+      </w:pPr>
+      <w:r>
+        <w:rPr>
+          <w:lang w:val="en-US"/>
+        </w:rPr>
+        <w:t>Plots suggest that the GA4 design is more robust to the values used, the results are consistent</w:t>
+      </w:r>
     </w:p>
     <w:p/>
     <w:sectPr>
@@ -1696,8 +3792,121 @@
 </file>
 
 <file path=word/numbering.xml><?xml version="1.0" encoding="utf-8"?>
-<w:numbering xmlns:wpc="http://schemas.microsoft.com/office/word/2010/wordprocessingCanvas" xmlns:cx="http://schemas.microsoft.com/office/drawing/2014/chartex" xmlns:cx1="http://schemas.microsoft.com/office/drawing/2015/9/8/chartex" xmlns:cx2="http://schemas.microsoft.com/office/drawing/2015/10/21/chartex" xmlns:cx3="http://schemas.microsoft.com/office/drawing/2016/5/9/chartex" xmlns:cx4="http://schemas.microsoft.com/office/drawing/2016/5/10/chartex" xmlns:cx5="http://schemas.microsoft.com/office/drawing/2016/5/11/chartex" xmlns:cx6="http://schemas.microsoft.com/office/drawing/2016/5/12/chartex" xmlns:cx7="http://schemas.microsoft.com/office/drawing/2016/5/13/chartex" xmlns:cx8="http://schemas.microsoft.com/office/drawing/2016/5/14/chartex" xmlns:mc="http://schemas.openxmlformats.org/markup-compatibility/2006" xmlns:aink="http://schemas.microsoft.com/office/drawing/2016/ink" xmlns:am3d="http://schemas.microsoft.com/office/drawing/2017/model3d" xmlns:o="urn:schemas-microsoft-com:office:office" xmlns:oel="http://schemas.microsoft.com/office/2019/extlst" xmlns:r="http://schemas.openxmlformats.org/officeDocument/2006/relationships" xmlns:m="http://schemas.openxmlformats.org/officeDocument/2006/math" xmlns:v="urn:schemas-microsoft-com:vml" xmlns:wp14="http://schemas.microsoft.com/office/word/2010/wordprocessingDrawing" xmlns:wp="http://schemas.openxmlformats.org/drawingml/2006/wordprocessingDrawing" xmlns:w10="urn:schemas-microsoft-com:office:word" xmlns:w="http://schemas.openxmlformats.org/wordprocessingml/2006/main" xmlns:w14="http://schemas.microsoft.com/office/word/2010/wordml" xmlns:w15="http://schemas.microsoft.com/office/word/2012/wordml" xmlns:w16cex="http://schemas.microsoft.com/office/word/2018/wordml/cex" xmlns:w16cid="http://schemas.microsoft.com/office/word/2016/wordml/cid" xmlns:w16="http://schemas.microsoft.com/office/word/2018/wordml" xmlns:w16sdtdh="http://schemas.microsoft.com/office/word/2020/wordml/sdtdatahash" xmlns:w16se="http://schemas.microsoft.com/office/word/2015/wordml/symex" xmlns:wpg="http://schemas.microsoft.com/office/word/2010/wordprocessingGroup" xmlns:wpi="http://schemas.microsoft.com/office/word/2010/wordprocessingInk" xmlns:wne="http://schemas.microsoft.com/office/word/2006/wordml" xmlns:wps="http://schemas.microsoft.com/office/word/2010/wordprocessingShape" mc:Ignorable="w14 w15 w16se w16cid w16 w16cex w16sdtdh wp14">
+<w:numbering xmlns:wpc="http://schemas.microsoft.com/office/word/2010/wordprocessingCanvas" xmlns:cx="http://schemas.microsoft.com/office/drawing/2014/chartex" xmlns:cx1="http://schemas.microsoft.com/office/drawing/2015/9/8/chartex" xmlns:cx2="http://schemas.microsoft.com/office/drawing/2015/10/21/chartex" xmlns:cx3="http://schemas.microsoft.com/office/drawing/2016/5/9/chartex" xmlns:cx4="http://schemas.microsoft.com/office/drawing/2016/5/10/chartex" xmlns:cx5="http://schemas.microsoft.com/office/drawing/2016/5/11/chartex" xmlns:cx6="http://schemas.microsoft.com/office/drawing/2016/5/12/chartex" xmlns:cx7="http://schemas.microsoft.com/office/drawing/2016/5/13/chartex" xmlns:cx8="http://schemas.microsoft.com/office/drawing/2016/5/14/chartex" xmlns:mc="http://schemas.openxmlformats.org/markup-compatibility/2006" xmlns:aink="http://schemas.microsoft.com/office/drawing/2016/ink" xmlns:am3d="http://schemas.microsoft.com/office/drawing/2017/model3d" xmlns:o="urn:schemas-microsoft-com:office:office" xmlns:oel="http://schemas.microsoft.com/office/2019/extlst" xmlns:r="http://schemas.openxmlformats.org/officeDocument/2006/relationships" xmlns:m="http://schemas.openxmlformats.org/officeDocument/2006/math" xmlns:v="urn:schemas-microsoft-com:vml" xmlns:wp14="http://schemas.microsoft.com/office/word/2010/wordprocessingDrawing" xmlns:wp="http://schemas.openxmlformats.org/drawingml/2006/wordprocessingDrawing" xmlns:w10="urn:schemas-microsoft-com:office:word" xmlns:w="http://schemas.openxmlformats.org/wordprocessingml/2006/main" xmlns:w14="http://schemas.microsoft.com/office/word/2010/wordml" xmlns:w15="http://schemas.microsoft.com/office/word/2012/wordml" xmlns:w16cex="http://schemas.microsoft.com/office/word/2018/wordml/cex" xmlns:w16cid="http://schemas.microsoft.com/office/word/2016/wordml/cid" xmlns:w16="http://schemas.microsoft.com/office/word/2018/wordml" xmlns:w16du="http://schemas.microsoft.com/office/word/2023/wordml/word16du" xmlns:w16sdtdh="http://schemas.microsoft.com/office/word/2020/wordml/sdtdatahash" xmlns:w16se="http://schemas.microsoft.com/office/word/2015/wordml/symex" xmlns:wpg="http://schemas.microsoft.com/office/word/2010/wordprocessingGroup" xmlns:wpi="http://schemas.microsoft.com/office/word/2010/wordprocessingInk" xmlns:wne="http://schemas.microsoft.com/office/word/2006/wordml" xmlns:wps="http://schemas.microsoft.com/office/word/2010/wordprocessingShape" mc:Ignorable="w14 w15 w16se w16cid w16 w16cex w16sdtdh w16du wp14">
   <w:abstractNum w:abstractNumId="0" w15:restartNumberingAfterBreak="0">
+    <w:nsid w:val="0AEC3311"/>
+    <w:multiLevelType w:val="hybridMultilevel"/>
+    <w:tmpl w:val="BEC88A36"/>
+    <w:lvl w:ilvl="0" w:tplc="1C090001">
+      <w:start w:val="1"/>
+      <w:numFmt w:val="bullet"/>
+      <w:lvlText w:val=""/>
+      <w:lvlJc w:val="left"/>
+      <w:pPr>
+        <w:ind w:left="720" w:hanging="360"/>
+      </w:pPr>
+      <w:rPr>
+        <w:rFonts w:ascii="Symbol" w:hAnsi="Symbol" w:hint="default"/>
+      </w:rPr>
+    </w:lvl>
+    <w:lvl w:ilvl="1" w:tplc="1C090003">
+      <w:start w:val="1"/>
+      <w:numFmt w:val="bullet"/>
+      <w:lvlText w:val="o"/>
+      <w:lvlJc w:val="left"/>
+      <w:pPr>
+        <w:ind w:left="1440" w:hanging="360"/>
+      </w:pPr>
+      <w:rPr>
+        <w:rFonts w:ascii="Courier New" w:hAnsi="Courier New" w:cs="Courier New" w:hint="default"/>
+      </w:rPr>
+    </w:lvl>
+    <w:lvl w:ilvl="2" w:tplc="1C090005" w:tentative="1">
+      <w:start w:val="1"/>
+      <w:numFmt w:val="bullet"/>
+      <w:lvlText w:val=""/>
+      <w:lvlJc w:val="left"/>
+      <w:pPr>
+        <w:ind w:left="2160" w:hanging="360"/>
+      </w:pPr>
+      <w:rPr>
+        <w:rFonts w:ascii="Wingdings" w:hAnsi="Wingdings" w:hint="default"/>
+      </w:rPr>
+    </w:lvl>
+    <w:lvl w:ilvl="3" w:tplc="1C090001" w:tentative="1">
+      <w:start w:val="1"/>
+      <w:numFmt w:val="bullet"/>
+      <w:lvlText w:val=""/>
+      <w:lvlJc w:val="left"/>
+      <w:pPr>
+        <w:ind w:left="2880" w:hanging="360"/>
+      </w:pPr>
+      <w:rPr>
+        <w:rFonts w:ascii="Symbol" w:hAnsi="Symbol" w:hint="default"/>
+      </w:rPr>
+    </w:lvl>
+    <w:lvl w:ilvl="4" w:tplc="1C090003" w:tentative="1">
+      <w:start w:val="1"/>
+      <w:numFmt w:val="bullet"/>
+      <w:lvlText w:val="o"/>
+      <w:lvlJc w:val="left"/>
+      <w:pPr>
+        <w:ind w:left="3600" w:hanging="360"/>
+      </w:pPr>
+      <w:rPr>
+        <w:rFonts w:ascii="Courier New" w:hAnsi="Courier New" w:cs="Courier New" w:hint="default"/>
+      </w:rPr>
+    </w:lvl>
+    <w:lvl w:ilvl="5" w:tplc="1C090005" w:tentative="1">
+      <w:start w:val="1"/>
+      <w:numFmt w:val="bullet"/>
+      <w:lvlText w:val=""/>
+      <w:lvlJc w:val="left"/>
+      <w:pPr>
+        <w:ind w:left="4320" w:hanging="360"/>
+      </w:pPr>
+      <w:rPr>
+        <w:rFonts w:ascii="Wingdings" w:hAnsi="Wingdings" w:hint="default"/>
+      </w:rPr>
+    </w:lvl>
+    <w:lvl w:ilvl="6" w:tplc="1C090001" w:tentative="1">
+      <w:start w:val="1"/>
+      <w:numFmt w:val="bullet"/>
+      <w:lvlText w:val=""/>
+      <w:lvlJc w:val="left"/>
+      <w:pPr>
+        <w:ind w:left="5040" w:hanging="360"/>
+      </w:pPr>
+      <w:rPr>
+        <w:rFonts w:ascii="Symbol" w:hAnsi="Symbol" w:hint="default"/>
+      </w:rPr>
+    </w:lvl>
+    <w:lvl w:ilvl="7" w:tplc="1C090003" w:tentative="1">
+      <w:start w:val="1"/>
+      <w:numFmt w:val="bullet"/>
+      <w:lvlText w:val="o"/>
+      <w:lvlJc w:val="left"/>
+      <w:pPr>
+        <w:ind w:left="5760" w:hanging="360"/>
+      </w:pPr>
+      <w:rPr>
+        <w:rFonts w:ascii="Courier New" w:hAnsi="Courier New" w:cs="Courier New" w:hint="default"/>
+      </w:rPr>
+    </w:lvl>
+    <w:lvl w:ilvl="8" w:tplc="1C090005" w:tentative="1">
+      <w:start w:val="1"/>
+      <w:numFmt w:val="bullet"/>
+      <w:lvlText w:val=""/>
+      <w:lvlJc w:val="left"/>
+      <w:pPr>
+        <w:ind w:left="6480" w:hanging="360"/>
+      </w:pPr>
+      <w:rPr>
+        <w:rFonts w:ascii="Wingdings" w:hAnsi="Wingdings" w:hint="default"/>
+      </w:rPr>
+    </w:lvl>
+  </w:abstractNum>
+  <w:abstractNum w:abstractNumId="1" w15:restartNumberingAfterBreak="0">
     <w:nsid w:val="329C35FB"/>
     <w:multiLevelType w:val="hybridMultilevel"/>
     <w:tmpl w:val="D6620B34"/>
@@ -1810,7 +4019,346 @@
       </w:rPr>
     </w:lvl>
   </w:abstractNum>
-  <w:abstractNum w:abstractNumId="1" w15:restartNumberingAfterBreak="0">
+  <w:abstractNum w:abstractNumId="2" w15:restartNumberingAfterBreak="0">
+    <w:nsid w:val="459B215E"/>
+    <w:multiLevelType w:val="hybridMultilevel"/>
+    <w:tmpl w:val="88A6D356"/>
+    <w:lvl w:ilvl="0" w:tplc="1C090001">
+      <w:start w:val="1"/>
+      <w:numFmt w:val="bullet"/>
+      <w:lvlText w:val=""/>
+      <w:lvlJc w:val="left"/>
+      <w:pPr>
+        <w:ind w:left="720" w:hanging="360"/>
+      </w:pPr>
+      <w:rPr>
+        <w:rFonts w:ascii="Symbol" w:hAnsi="Symbol" w:hint="default"/>
+      </w:rPr>
+    </w:lvl>
+    <w:lvl w:ilvl="1" w:tplc="1C090003">
+      <w:start w:val="1"/>
+      <w:numFmt w:val="bullet"/>
+      <w:lvlText w:val="o"/>
+      <w:lvlJc w:val="left"/>
+      <w:pPr>
+        <w:ind w:left="1440" w:hanging="360"/>
+      </w:pPr>
+      <w:rPr>
+        <w:rFonts w:ascii="Courier New" w:hAnsi="Courier New" w:cs="Courier New" w:hint="default"/>
+      </w:rPr>
+    </w:lvl>
+    <w:lvl w:ilvl="2" w:tplc="1C090005" w:tentative="1">
+      <w:start w:val="1"/>
+      <w:numFmt w:val="bullet"/>
+      <w:lvlText w:val=""/>
+      <w:lvlJc w:val="left"/>
+      <w:pPr>
+        <w:ind w:left="2160" w:hanging="360"/>
+      </w:pPr>
+      <w:rPr>
+        <w:rFonts w:ascii="Wingdings" w:hAnsi="Wingdings" w:hint="default"/>
+      </w:rPr>
+    </w:lvl>
+    <w:lvl w:ilvl="3" w:tplc="1C090001" w:tentative="1">
+      <w:start w:val="1"/>
+      <w:numFmt w:val="bullet"/>
+      <w:lvlText w:val=""/>
+      <w:lvlJc w:val="left"/>
+      <w:pPr>
+        <w:ind w:left="2880" w:hanging="360"/>
+      </w:pPr>
+      <w:rPr>
+        <w:rFonts w:ascii="Symbol" w:hAnsi="Symbol" w:hint="default"/>
+      </w:rPr>
+    </w:lvl>
+    <w:lvl w:ilvl="4" w:tplc="1C090003" w:tentative="1">
+      <w:start w:val="1"/>
+      <w:numFmt w:val="bullet"/>
+      <w:lvlText w:val="o"/>
+      <w:lvlJc w:val="left"/>
+      <w:pPr>
+        <w:ind w:left="3600" w:hanging="360"/>
+      </w:pPr>
+      <w:rPr>
+        <w:rFonts w:ascii="Courier New" w:hAnsi="Courier New" w:cs="Courier New" w:hint="default"/>
+      </w:rPr>
+    </w:lvl>
+    <w:lvl w:ilvl="5" w:tplc="1C090005" w:tentative="1">
+      <w:start w:val="1"/>
+      <w:numFmt w:val="bullet"/>
+      <w:lvlText w:val=""/>
+      <w:lvlJc w:val="left"/>
+      <w:pPr>
+        <w:ind w:left="4320" w:hanging="360"/>
+      </w:pPr>
+      <w:rPr>
+        <w:rFonts w:ascii="Wingdings" w:hAnsi="Wingdings" w:hint="default"/>
+      </w:rPr>
+    </w:lvl>
+    <w:lvl w:ilvl="6" w:tplc="1C090001" w:tentative="1">
+      <w:start w:val="1"/>
+      <w:numFmt w:val="bullet"/>
+      <w:lvlText w:val=""/>
+      <w:lvlJc w:val="left"/>
+      <w:pPr>
+        <w:ind w:left="5040" w:hanging="360"/>
+      </w:pPr>
+      <w:rPr>
+        <w:rFonts w:ascii="Symbol" w:hAnsi="Symbol" w:hint="default"/>
+      </w:rPr>
+    </w:lvl>
+    <w:lvl w:ilvl="7" w:tplc="1C090003" w:tentative="1">
+      <w:start w:val="1"/>
+      <w:numFmt w:val="bullet"/>
+      <w:lvlText w:val="o"/>
+      <w:lvlJc w:val="left"/>
+      <w:pPr>
+        <w:ind w:left="5760" w:hanging="360"/>
+      </w:pPr>
+      <w:rPr>
+        <w:rFonts w:ascii="Courier New" w:hAnsi="Courier New" w:cs="Courier New" w:hint="default"/>
+      </w:rPr>
+    </w:lvl>
+    <w:lvl w:ilvl="8" w:tplc="1C090005" w:tentative="1">
+      <w:start w:val="1"/>
+      <w:numFmt w:val="bullet"/>
+      <w:lvlText w:val=""/>
+      <w:lvlJc w:val="left"/>
+      <w:pPr>
+        <w:ind w:left="6480" w:hanging="360"/>
+      </w:pPr>
+      <w:rPr>
+        <w:rFonts w:ascii="Wingdings" w:hAnsi="Wingdings" w:hint="default"/>
+      </w:rPr>
+    </w:lvl>
+  </w:abstractNum>
+  <w:abstractNum w:abstractNumId="3" w15:restartNumberingAfterBreak="0">
+    <w:nsid w:val="48023D5E"/>
+    <w:multiLevelType w:val="hybridMultilevel"/>
+    <w:tmpl w:val="EBB2D3B6"/>
+    <w:lvl w:ilvl="0" w:tplc="1C090001">
+      <w:start w:val="1"/>
+      <w:numFmt w:val="bullet"/>
+      <w:lvlText w:val=""/>
+      <w:lvlJc w:val="left"/>
+      <w:pPr>
+        <w:ind w:left="720" w:hanging="360"/>
+      </w:pPr>
+      <w:rPr>
+        <w:rFonts w:ascii="Symbol" w:hAnsi="Symbol" w:hint="default"/>
+      </w:rPr>
+    </w:lvl>
+    <w:lvl w:ilvl="1" w:tplc="1C090003">
+      <w:start w:val="1"/>
+      <w:numFmt w:val="bullet"/>
+      <w:lvlText w:val="o"/>
+      <w:lvlJc w:val="left"/>
+      <w:pPr>
+        <w:ind w:left="1440" w:hanging="360"/>
+      </w:pPr>
+      <w:rPr>
+        <w:rFonts w:ascii="Courier New" w:hAnsi="Courier New" w:cs="Courier New" w:hint="default"/>
+      </w:rPr>
+    </w:lvl>
+    <w:lvl w:ilvl="2" w:tplc="1C090005" w:tentative="1">
+      <w:start w:val="1"/>
+      <w:numFmt w:val="bullet"/>
+      <w:lvlText w:val=""/>
+      <w:lvlJc w:val="left"/>
+      <w:pPr>
+        <w:ind w:left="2160" w:hanging="360"/>
+      </w:pPr>
+      <w:rPr>
+        <w:rFonts w:ascii="Wingdings" w:hAnsi="Wingdings" w:hint="default"/>
+      </w:rPr>
+    </w:lvl>
+    <w:lvl w:ilvl="3" w:tplc="1C090001" w:tentative="1">
+      <w:start w:val="1"/>
+      <w:numFmt w:val="bullet"/>
+      <w:lvlText w:val=""/>
+      <w:lvlJc w:val="left"/>
+      <w:pPr>
+        <w:ind w:left="2880" w:hanging="360"/>
+      </w:pPr>
+      <w:rPr>
+        <w:rFonts w:ascii="Symbol" w:hAnsi="Symbol" w:hint="default"/>
+      </w:rPr>
+    </w:lvl>
+    <w:lvl w:ilvl="4" w:tplc="1C090003" w:tentative="1">
+      <w:start w:val="1"/>
+      <w:numFmt w:val="bullet"/>
+      <w:lvlText w:val="o"/>
+      <w:lvlJc w:val="left"/>
+      <w:pPr>
+        <w:ind w:left="3600" w:hanging="360"/>
+      </w:pPr>
+      <w:rPr>
+        <w:rFonts w:ascii="Courier New" w:hAnsi="Courier New" w:cs="Courier New" w:hint="default"/>
+      </w:rPr>
+    </w:lvl>
+    <w:lvl w:ilvl="5" w:tplc="1C090005" w:tentative="1">
+      <w:start w:val="1"/>
+      <w:numFmt w:val="bullet"/>
+      <w:lvlText w:val=""/>
+      <w:lvlJc w:val="left"/>
+      <w:pPr>
+        <w:ind w:left="4320" w:hanging="360"/>
+      </w:pPr>
+      <w:rPr>
+        <w:rFonts w:ascii="Wingdings" w:hAnsi="Wingdings" w:hint="default"/>
+      </w:rPr>
+    </w:lvl>
+    <w:lvl w:ilvl="6" w:tplc="1C090001" w:tentative="1">
+      <w:start w:val="1"/>
+      <w:numFmt w:val="bullet"/>
+      <w:lvlText w:val=""/>
+      <w:lvlJc w:val="left"/>
+      <w:pPr>
+        <w:ind w:left="5040" w:hanging="360"/>
+      </w:pPr>
+      <w:rPr>
+        <w:rFonts w:ascii="Symbol" w:hAnsi="Symbol" w:hint="default"/>
+      </w:rPr>
+    </w:lvl>
+    <w:lvl w:ilvl="7" w:tplc="1C090003" w:tentative="1">
+      <w:start w:val="1"/>
+      <w:numFmt w:val="bullet"/>
+      <w:lvlText w:val="o"/>
+      <w:lvlJc w:val="left"/>
+      <w:pPr>
+        <w:ind w:left="5760" w:hanging="360"/>
+      </w:pPr>
+      <w:rPr>
+        <w:rFonts w:ascii="Courier New" w:hAnsi="Courier New" w:cs="Courier New" w:hint="default"/>
+      </w:rPr>
+    </w:lvl>
+    <w:lvl w:ilvl="8" w:tplc="1C090005" w:tentative="1">
+      <w:start w:val="1"/>
+      <w:numFmt w:val="bullet"/>
+      <w:lvlText w:val=""/>
+      <w:lvlJc w:val="left"/>
+      <w:pPr>
+        <w:ind w:left="6480" w:hanging="360"/>
+      </w:pPr>
+      <w:rPr>
+        <w:rFonts w:ascii="Wingdings" w:hAnsi="Wingdings" w:hint="default"/>
+      </w:rPr>
+    </w:lvl>
+  </w:abstractNum>
+  <w:abstractNum w:abstractNumId="4" w15:restartNumberingAfterBreak="0">
+    <w:nsid w:val="5AA23D50"/>
+    <w:multiLevelType w:val="hybridMultilevel"/>
+    <w:tmpl w:val="EB082FDE"/>
+    <w:lvl w:ilvl="0" w:tplc="1C090001">
+      <w:start w:val="1"/>
+      <w:numFmt w:val="bullet"/>
+      <w:lvlText w:val=""/>
+      <w:lvlJc w:val="left"/>
+      <w:pPr>
+        <w:ind w:left="720" w:hanging="360"/>
+      </w:pPr>
+      <w:rPr>
+        <w:rFonts w:ascii="Symbol" w:hAnsi="Symbol" w:hint="default"/>
+      </w:rPr>
+    </w:lvl>
+    <w:lvl w:ilvl="1" w:tplc="1C090003">
+      <w:start w:val="1"/>
+      <w:numFmt w:val="bullet"/>
+      <w:lvlText w:val="o"/>
+      <w:lvlJc w:val="left"/>
+      <w:pPr>
+        <w:ind w:left="1440" w:hanging="360"/>
+      </w:pPr>
+      <w:rPr>
+        <w:rFonts w:ascii="Courier New" w:hAnsi="Courier New" w:cs="Courier New" w:hint="default"/>
+      </w:rPr>
+    </w:lvl>
+    <w:lvl w:ilvl="2" w:tplc="1C090005" w:tentative="1">
+      <w:start w:val="1"/>
+      <w:numFmt w:val="bullet"/>
+      <w:lvlText w:val=""/>
+      <w:lvlJc w:val="left"/>
+      <w:pPr>
+        <w:ind w:left="2160" w:hanging="360"/>
+      </w:pPr>
+      <w:rPr>
+        <w:rFonts w:ascii="Wingdings" w:hAnsi="Wingdings" w:hint="default"/>
+      </w:rPr>
+    </w:lvl>
+    <w:lvl w:ilvl="3" w:tplc="1C090001" w:tentative="1">
+      <w:start w:val="1"/>
+      <w:numFmt w:val="bullet"/>
+      <w:lvlText w:val=""/>
+      <w:lvlJc w:val="left"/>
+      <w:pPr>
+        <w:ind w:left="2880" w:hanging="360"/>
+      </w:pPr>
+      <w:rPr>
+        <w:rFonts w:ascii="Symbol" w:hAnsi="Symbol" w:hint="default"/>
+      </w:rPr>
+    </w:lvl>
+    <w:lvl w:ilvl="4" w:tplc="1C090003" w:tentative="1">
+      <w:start w:val="1"/>
+      <w:numFmt w:val="bullet"/>
+      <w:lvlText w:val="o"/>
+      <w:lvlJc w:val="left"/>
+      <w:pPr>
+        <w:ind w:left="3600" w:hanging="360"/>
+      </w:pPr>
+      <w:rPr>
+        <w:rFonts w:ascii="Courier New" w:hAnsi="Courier New" w:cs="Courier New" w:hint="default"/>
+      </w:rPr>
+    </w:lvl>
+    <w:lvl w:ilvl="5" w:tplc="1C090005" w:tentative="1">
+      <w:start w:val="1"/>
+      <w:numFmt w:val="bullet"/>
+      <w:lvlText w:val=""/>
+      <w:lvlJc w:val="left"/>
+      <w:pPr>
+        <w:ind w:left="4320" w:hanging="360"/>
+      </w:pPr>
+      <w:rPr>
+        <w:rFonts w:ascii="Wingdings" w:hAnsi="Wingdings" w:hint="default"/>
+      </w:rPr>
+    </w:lvl>
+    <w:lvl w:ilvl="6" w:tplc="1C090001" w:tentative="1">
+      <w:start w:val="1"/>
+      <w:numFmt w:val="bullet"/>
+      <w:lvlText w:val=""/>
+      <w:lvlJc w:val="left"/>
+      <w:pPr>
+        <w:ind w:left="5040" w:hanging="360"/>
+      </w:pPr>
+      <w:rPr>
+        <w:rFonts w:ascii="Symbol" w:hAnsi="Symbol" w:hint="default"/>
+      </w:rPr>
+    </w:lvl>
+    <w:lvl w:ilvl="7" w:tplc="1C090003" w:tentative="1">
+      <w:start w:val="1"/>
+      <w:numFmt w:val="bullet"/>
+      <w:lvlText w:val="o"/>
+      <w:lvlJc w:val="left"/>
+      <w:pPr>
+        <w:ind w:left="5760" w:hanging="360"/>
+      </w:pPr>
+      <w:rPr>
+        <w:rFonts w:ascii="Courier New" w:hAnsi="Courier New" w:cs="Courier New" w:hint="default"/>
+      </w:rPr>
+    </w:lvl>
+    <w:lvl w:ilvl="8" w:tplc="1C090005" w:tentative="1">
+      <w:start w:val="1"/>
+      <w:numFmt w:val="bullet"/>
+      <w:lvlText w:val=""/>
+      <w:lvlJc w:val="left"/>
+      <w:pPr>
+        <w:ind w:left="6480" w:hanging="360"/>
+      </w:pPr>
+      <w:rPr>
+        <w:rFonts w:ascii="Wingdings" w:hAnsi="Wingdings" w:hint="default"/>
+      </w:rPr>
+    </w:lvl>
+  </w:abstractNum>
+  <w:abstractNum w:abstractNumId="5" w15:restartNumberingAfterBreak="0">
     <w:nsid w:val="69C57D89"/>
     <w:multiLevelType w:val="hybridMultilevel"/>
     <w:tmpl w:val="A7E44EAA"/>
@@ -1924,16 +4472,28 @@
     </w:lvl>
   </w:abstractNum>
   <w:num w:numId="1" w16cid:durableId="900555846">
+    <w:abstractNumId w:val="5"/>
+  </w:num>
+  <w:num w:numId="2" w16cid:durableId="341706045">
     <w:abstractNumId w:val="1"/>
   </w:num>
-  <w:num w:numId="2" w16cid:durableId="341706045">
+  <w:num w:numId="3" w16cid:durableId="1749767899">
+    <w:abstractNumId w:val="3"/>
+  </w:num>
+  <w:num w:numId="4" w16cid:durableId="581764023">
+    <w:abstractNumId w:val="2"/>
+  </w:num>
+  <w:num w:numId="5" w16cid:durableId="405493899">
     <w:abstractNumId w:val="0"/>
+  </w:num>
+  <w:num w:numId="6" w16cid:durableId="875772943">
+    <w:abstractNumId w:val="4"/>
   </w:num>
 </w:numbering>
 </file>
 
 <file path=word/styles.xml><?xml version="1.0" encoding="utf-8"?>
-<w:styles xmlns:mc="http://schemas.openxmlformats.org/markup-compatibility/2006" xmlns:r="http://schemas.openxmlformats.org/officeDocument/2006/relationships" xmlns:w="http://schemas.openxmlformats.org/wordprocessingml/2006/main" xmlns:w14="http://schemas.microsoft.com/office/word/2010/wordml" xmlns:w15="http://schemas.microsoft.com/office/word/2012/wordml" xmlns:w16cex="http://schemas.microsoft.com/office/word/2018/wordml/cex" xmlns:w16cid="http://schemas.microsoft.com/office/word/2016/wordml/cid" xmlns:w16="http://schemas.microsoft.com/office/word/2018/wordml" xmlns:w16sdtdh="http://schemas.microsoft.com/office/word/2020/wordml/sdtdatahash" xmlns:w16se="http://schemas.microsoft.com/office/word/2015/wordml/symex" mc:Ignorable="w14 w15 w16se w16cid w16 w16cex w16sdtdh">
+<w:styles xmlns:mc="http://schemas.openxmlformats.org/markup-compatibility/2006" xmlns:r="http://schemas.openxmlformats.org/officeDocument/2006/relationships" xmlns:w="http://schemas.openxmlformats.org/wordprocessingml/2006/main" xmlns:w14="http://schemas.microsoft.com/office/word/2010/wordml" xmlns:w15="http://schemas.microsoft.com/office/word/2012/wordml" xmlns:w16cex="http://schemas.microsoft.com/office/word/2018/wordml/cex" xmlns:w16cid="http://schemas.microsoft.com/office/word/2016/wordml/cid" xmlns:w16="http://schemas.microsoft.com/office/word/2018/wordml" xmlns:w16du="http://schemas.microsoft.com/office/word/2023/wordml/word16du" xmlns:w16sdtdh="http://schemas.microsoft.com/office/word/2020/wordml/sdtdatahash" xmlns:w16se="http://schemas.microsoft.com/office/word/2015/wordml/symex" mc:Ignorable="w14 w15 w16se w16cid w16 w16cex w16sdtdh w16du">
   <w:docDefaults>
     <w:rPrDefault>
       <w:rPr>

</xml_diff>